<commit_message>
intermediate: trying to fix the boundary elements.
</commit_message>
<xml_diff>
--- a/RandomRVEGenerator/RandomRVEGenerator_UsersManual.docx
+++ b/RandomRVEGenerator/RandomRVEGenerator_UsersManual.docx
@@ -25,7 +25,15 @@
     </w:p>
     <w:p>
       <w:r>
-        <w:t>Husseini, J.F., Pineda, E.J., Stapleton, S.E., “Generation of artificial 2-D fiber reinforced composite microstructures with statistically equivalent features” Composite Part A: Applied Science and Manufacturing, Vol. 164, 2023. doi: 10.1016/j.compositesa.2022.107260</w:t>
+        <w:t xml:space="preserve">Husseini, J.F., Pineda, E.J., Stapleton, S.E., “Generation of artificial 2-D fiber reinforced composite microstructures with statistically equivalent features” Composite Part A: Applied Science and Manufacturing, Vol. 164, 2023. </w:t>
+      </w:r>
+      <w:proofErr w:type="spellStart"/>
+      <w:r>
+        <w:t>doi</w:t>
+      </w:r>
+      <w:proofErr w:type="spellEnd"/>
+      <w:r>
+        <w:t>: 10.1016/j.compositesa.2022.107260</w:t>
       </w:r>
     </w:p>
     <w:p>
@@ -43,7 +51,23 @@
     </w:p>
     <w:p>
       <w:r>
-        <w:t xml:space="preserve">General format: program is run via text input files.  Output can be requested in the form of .csv files with fiber positions/radii only or a file of the generation process to be read by PlotFDEM (_all).  </w:t>
+        <w:t>General format: program is run via text input files.  Output can be requested in the form of .csv files with fiber positions/</w:t>
+      </w:r>
+      <w:proofErr w:type="gramStart"/>
+      <w:r>
+        <w:t>radii</w:t>
+      </w:r>
+      <w:proofErr w:type="gramEnd"/>
+      <w:r>
+        <w:t xml:space="preserve"> only or a file of the generation process to be read by </w:t>
+      </w:r>
+      <w:proofErr w:type="spellStart"/>
+      <w:r>
+        <w:t>PlotFDEM</w:t>
+      </w:r>
+      <w:proofErr w:type="spellEnd"/>
+      <w:r>
+        <w:t xml:space="preserve"> (_all).  </w:t>
       </w:r>
     </w:p>
     <w:p>
@@ -195,12 +219,14 @@
           <w:rFonts w:ascii="Consolas" w:eastAsia="Consolas" w:hAnsi="Consolas" w:cs="Consolas"/>
         </w:rPr>
       </w:pPr>
+      <w:proofErr w:type="spellStart"/>
       <w:r>
         <w:rPr>
           <w:rFonts w:ascii="Consolas" w:eastAsia="Consolas" w:hAnsi="Consolas" w:cs="Consolas"/>
         </w:rPr>
         <w:t>Vf</w:t>
       </w:r>
+      <w:proofErr w:type="spellEnd"/>
       <w:r>
         <w:rPr>
           <w:rFonts w:ascii="Consolas" w:eastAsia="Consolas" w:hAnsi="Consolas" w:cs="Consolas"/>
@@ -229,12 +255,14 @@
           <w:rFonts w:ascii="Consolas" w:eastAsia="Consolas" w:hAnsi="Consolas" w:cs="Consolas"/>
         </w:rPr>
       </w:pPr>
+      <w:proofErr w:type="spellStart"/>
       <w:r>
         <w:rPr>
           <w:rFonts w:ascii="Consolas" w:eastAsia="Consolas" w:hAnsi="Consolas" w:cs="Consolas"/>
         </w:rPr>
         <w:t>nRows</w:t>
       </w:r>
+      <w:proofErr w:type="spellEnd"/>
       <w:r>
         <w:rPr>
           <w:rFonts w:ascii="Consolas" w:eastAsia="Consolas" w:hAnsi="Consolas" w:cs="Consolas"/>
@@ -263,12 +291,14 @@
           <w:rFonts w:ascii="Consolas" w:eastAsia="Consolas" w:hAnsi="Consolas" w:cs="Consolas"/>
         </w:rPr>
       </w:pPr>
+      <w:proofErr w:type="spellStart"/>
       <w:r>
         <w:rPr>
           <w:rFonts w:ascii="Consolas" w:eastAsia="Consolas" w:hAnsi="Consolas" w:cs="Consolas"/>
         </w:rPr>
         <w:t>nRep</w:t>
       </w:r>
+      <w:proofErr w:type="spellEnd"/>
       <w:r>
         <w:rPr>
           <w:rFonts w:ascii="Consolas" w:eastAsia="Consolas" w:hAnsi="Consolas" w:cs="Consolas"/>
@@ -339,12 +369,14 @@
           <w:rFonts w:ascii="Consolas" w:eastAsia="Consolas" w:hAnsi="Consolas" w:cs="Consolas"/>
         </w:rPr>
       </w:pPr>
+      <w:proofErr w:type="spellStart"/>
       <w:r>
         <w:rPr>
           <w:rFonts w:ascii="Consolas" w:eastAsia="Consolas" w:hAnsi="Consolas" w:cs="Consolas"/>
         </w:rPr>
         <w:t>MinSpacing</w:t>
       </w:r>
+      <w:proofErr w:type="spellEnd"/>
       <w:r>
         <w:rPr>
           <w:rFonts w:ascii="Consolas" w:eastAsia="Consolas" w:hAnsi="Consolas" w:cs="Consolas"/>
@@ -360,12 +392,14 @@
           <w:rFonts w:ascii="Consolas" w:eastAsia="Consolas" w:hAnsi="Consolas" w:cs="Consolas"/>
         </w:rPr>
       </w:pPr>
+      <w:proofErr w:type="spellStart"/>
       <w:r>
         <w:rPr>
           <w:rFonts w:ascii="Consolas" w:eastAsia="Consolas" w:hAnsi="Consolas" w:cs="Consolas"/>
         </w:rPr>
         <w:t>FPerSquare</w:t>
       </w:r>
+      <w:proofErr w:type="spellEnd"/>
       <w:r>
         <w:rPr>
           <w:rFonts w:ascii="Consolas" w:eastAsia="Consolas" w:hAnsi="Consolas" w:cs="Consolas"/>
@@ -402,12 +436,14 @@
           <w:rFonts w:ascii="Consolas" w:eastAsia="Consolas" w:hAnsi="Consolas" w:cs="Consolas"/>
         </w:rPr>
       </w:pPr>
+      <w:proofErr w:type="spellStart"/>
       <w:r>
         <w:rPr>
           <w:rFonts w:ascii="Consolas" w:eastAsia="Consolas" w:hAnsi="Consolas" w:cs="Consolas"/>
         </w:rPr>
         <w:t>ConDamp</w:t>
       </w:r>
+      <w:proofErr w:type="spellEnd"/>
       <w:r>
         <w:rPr>
           <w:rFonts w:ascii="Consolas" w:eastAsia="Consolas" w:hAnsi="Consolas" w:cs="Consolas"/>
@@ -423,12 +459,14 @@
           <w:rFonts w:ascii="Consolas" w:eastAsia="Consolas" w:hAnsi="Consolas" w:cs="Consolas"/>
         </w:rPr>
       </w:pPr>
+      <w:proofErr w:type="spellStart"/>
       <w:r>
         <w:rPr>
           <w:rFonts w:ascii="Consolas" w:eastAsia="Consolas" w:hAnsi="Consolas" w:cs="Consolas"/>
         </w:rPr>
         <w:t>GlobDamp</w:t>
       </w:r>
+      <w:proofErr w:type="spellEnd"/>
       <w:r>
         <w:rPr>
           <w:rFonts w:ascii="Consolas" w:eastAsia="Consolas" w:hAnsi="Consolas" w:cs="Consolas"/>
@@ -444,12 +482,14 @@
           <w:rFonts w:ascii="Consolas" w:eastAsia="Consolas" w:hAnsi="Consolas" w:cs="Consolas"/>
         </w:rPr>
       </w:pPr>
+      <w:proofErr w:type="spellStart"/>
       <w:r>
         <w:rPr>
           <w:rFonts w:ascii="Consolas" w:eastAsia="Consolas" w:hAnsi="Consolas" w:cs="Consolas"/>
         </w:rPr>
         <w:t>MaxSteps</w:t>
       </w:r>
+      <w:proofErr w:type="spellEnd"/>
       <w:r>
         <w:rPr>
           <w:rFonts w:ascii="Consolas" w:eastAsia="Consolas" w:hAnsi="Consolas" w:cs="Consolas"/>
@@ -465,12 +505,14 @@
           <w:rFonts w:ascii="Consolas" w:eastAsia="Consolas" w:hAnsi="Consolas" w:cs="Consolas"/>
         </w:rPr>
       </w:pPr>
+      <w:proofErr w:type="spellStart"/>
       <w:r>
         <w:rPr>
           <w:rFonts w:ascii="Consolas" w:eastAsia="Consolas" w:hAnsi="Consolas" w:cs="Consolas"/>
         </w:rPr>
         <w:t>UndampedSteps</w:t>
       </w:r>
+      <w:proofErr w:type="spellEnd"/>
       <w:r>
         <w:rPr>
           <w:rFonts w:ascii="Consolas" w:eastAsia="Consolas" w:hAnsi="Consolas" w:cs="Consolas"/>
@@ -486,6 +528,7 @@
           <w:rFonts w:ascii="Consolas" w:eastAsia="Consolas" w:hAnsi="Consolas" w:cs="Consolas"/>
         </w:rPr>
       </w:pPr>
+      <w:proofErr w:type="spellStart"/>
       <w:r>
         <w:rPr>
           <w:rFonts w:ascii="Consolas" w:eastAsia="Consolas" w:hAnsi="Consolas" w:cs="Consolas"/>
@@ -493,6 +536,7 @@
         <w:lastRenderedPageBreak/>
         <w:t>SaveFinalPositions</w:t>
       </w:r>
+      <w:proofErr w:type="spellEnd"/>
       <w:r>
         <w:rPr>
           <w:rFonts w:ascii="Consolas" w:eastAsia="Consolas" w:hAnsi="Consolas" w:cs="Consolas"/>
@@ -508,12 +552,14 @@
           <w:rFonts w:ascii="Consolas" w:eastAsia="Consolas" w:hAnsi="Consolas" w:cs="Consolas"/>
         </w:rPr>
       </w:pPr>
+      <w:proofErr w:type="spellStart"/>
       <w:r>
         <w:rPr>
           <w:rFonts w:ascii="Consolas" w:eastAsia="Consolas" w:hAnsi="Consolas" w:cs="Consolas"/>
         </w:rPr>
         <w:t>SaveResults</w:t>
       </w:r>
+      <w:proofErr w:type="spellEnd"/>
       <w:r>
         <w:rPr>
           <w:rFonts w:ascii="Consolas" w:eastAsia="Consolas" w:hAnsi="Consolas" w:cs="Consolas"/>
@@ -529,12 +575,14 @@
           <w:rFonts w:ascii="Consolas" w:eastAsia="Consolas" w:hAnsi="Consolas" w:cs="Consolas"/>
         </w:rPr>
       </w:pPr>
+      <w:proofErr w:type="spellStart"/>
       <w:r>
         <w:rPr>
           <w:rFonts w:ascii="Consolas" w:eastAsia="Consolas" w:hAnsi="Consolas" w:cs="Consolas"/>
         </w:rPr>
         <w:t>MultipleRadii</w:t>
       </w:r>
+      <w:proofErr w:type="spellEnd"/>
       <w:r>
         <w:rPr>
           <w:rFonts w:ascii="Consolas" w:eastAsia="Consolas" w:hAnsi="Consolas" w:cs="Consolas"/>
@@ -550,12 +598,14 @@
           <w:rFonts w:ascii="Consolas" w:eastAsia="Consolas" w:hAnsi="Consolas" w:cs="Consolas"/>
         </w:rPr>
       </w:pPr>
+      <w:proofErr w:type="spellStart"/>
       <w:r>
         <w:rPr>
           <w:rFonts w:ascii="Consolas" w:eastAsia="Consolas" w:hAnsi="Consolas" w:cs="Consolas"/>
         </w:rPr>
         <w:t>DoNotAllowOverlaps</w:t>
       </w:r>
+      <w:proofErr w:type="spellEnd"/>
       <w:r>
         <w:rPr>
           <w:rFonts w:ascii="Consolas" w:eastAsia="Consolas" w:hAnsi="Consolas" w:cs="Consolas"/>
@@ -592,12 +642,14 @@
           <w:rFonts w:ascii="Consolas" w:eastAsia="Consolas" w:hAnsi="Consolas" w:cs="Consolas"/>
         </w:rPr>
       </w:pPr>
+      <w:proofErr w:type="spellStart"/>
       <w:r>
         <w:rPr>
           <w:rFonts w:ascii="Consolas" w:eastAsia="Consolas" w:hAnsi="Consolas" w:cs="Consolas"/>
         </w:rPr>
         <w:t>MinBoundarySpacing</w:t>
       </w:r>
+      <w:proofErr w:type="spellEnd"/>
       <w:r>
         <w:rPr>
           <w:rFonts w:ascii="Consolas" w:eastAsia="Consolas" w:hAnsi="Consolas" w:cs="Consolas"/>
@@ -631,7 +683,21 @@
         <w:rPr>
           <w:rFonts w:ascii="Consolas" w:eastAsia="Consolas" w:hAnsi="Consolas" w:cs="Consolas"/>
         </w:rPr>
-        <w:t>** Separate option name and value with one tab.  Use True/False for booleans.</w:t>
+        <w:t xml:space="preserve">** Separate option name and value with one tab.  Use True/False for </w:t>
+      </w:r>
+      <w:proofErr w:type="spellStart"/>
+      <w:r>
+        <w:rPr>
+          <w:rFonts w:ascii="Consolas" w:eastAsia="Consolas" w:hAnsi="Consolas" w:cs="Consolas"/>
+        </w:rPr>
+        <w:t>booleans</w:t>
+      </w:r>
+      <w:proofErr w:type="spellEnd"/>
+      <w:r>
+        <w:rPr>
+          <w:rFonts w:ascii="Consolas" w:eastAsia="Consolas" w:hAnsi="Consolas" w:cs="Consolas"/>
+        </w:rPr>
+        <w:t>.</w:t>
       </w:r>
     </w:p>
     <w:p>
@@ -823,7 +889,15 @@
     </w:p>
     <w:p>
       <w:r>
-        <w:t>This is the radius of the fiber.  Normally this is in micrometers, but units can be whatever the user would like, as long as it’s consistent.  If there are multiple radii or a radius distribution is used, this value is replaced, but something must be here, nonetheless.</w:t>
+        <w:t xml:space="preserve">This is the radius of the fiber.  Normally this is in micrometers, but units can be whatever the user would like, as long as it’s consistent.  If there are multiple </w:t>
+      </w:r>
+      <w:proofErr w:type="gramStart"/>
+      <w:r>
+        <w:t>radii</w:t>
+      </w:r>
+      <w:proofErr w:type="gramEnd"/>
+      <w:r>
+        <w:t xml:space="preserve"> or a radius distribution is used, this value is replaced, but something must be here, nonetheless.</w:t>
       </w:r>
     </w:p>
     <w:p>
@@ -878,12 +952,14 @@
           <w:rFonts w:ascii="Consolas" w:eastAsia="Consolas" w:hAnsi="Consolas" w:cs="Consolas"/>
         </w:rPr>
       </w:pPr>
+      <w:proofErr w:type="spellStart"/>
       <w:r>
         <w:rPr>
           <w:rFonts w:ascii="Consolas" w:eastAsia="Consolas" w:hAnsi="Consolas" w:cs="Consolas"/>
         </w:rPr>
         <w:t>Vf</w:t>
       </w:r>
+      <w:proofErr w:type="spellEnd"/>
       <w:r>
         <w:rPr>
           <w:rFonts w:ascii="Consolas" w:eastAsia="Consolas" w:hAnsi="Consolas" w:cs="Consolas"/>
@@ -915,21 +991,31 @@
     </w:p>
     <w:p>
       <w:r>
-        <w:t>This is the square root of the total number of fibers.  The number of fibers is dictated this way because hexagonal packing was the first packing implemented, and for that packing the number of rows is a more relevant metric.  Options can be chosen to make this the number of fibers instead (IsNRowsActualltNFibers)</w:t>
-      </w:r>
-    </w:p>
-    <w:p>
-      <w:pPr>
-        <w:rPr>
-          <w:rFonts w:ascii="Consolas" w:eastAsia="Consolas" w:hAnsi="Consolas" w:cs="Consolas"/>
-        </w:rPr>
-      </w:pPr>
+        <w:t>This is the square root of the total number of fibers.  The number of fibers is dictated this way because hexagonal packing was the first packing implemented, and for that packing the number of rows is a more relevant metric.  Options can be chosen to make this the number of fibers instead (</w:t>
+      </w:r>
+      <w:proofErr w:type="spellStart"/>
+      <w:r>
+        <w:t>IsNRowsActualltNFibers</w:t>
+      </w:r>
+      <w:proofErr w:type="spellEnd"/>
+      <w:r>
+        <w:t>)</w:t>
+      </w:r>
+    </w:p>
+    <w:p>
+      <w:pPr>
+        <w:rPr>
+          <w:rFonts w:ascii="Consolas" w:eastAsia="Consolas" w:hAnsi="Consolas" w:cs="Consolas"/>
+        </w:rPr>
+      </w:pPr>
+      <w:proofErr w:type="spellStart"/>
       <w:r>
         <w:rPr>
           <w:rFonts w:ascii="Consolas" w:eastAsia="Consolas" w:hAnsi="Consolas" w:cs="Consolas"/>
         </w:rPr>
         <w:t>nRows</w:t>
       </w:r>
+      <w:proofErr w:type="spellEnd"/>
       <w:r>
         <w:rPr>
           <w:rFonts w:ascii="Consolas" w:eastAsia="Consolas" w:hAnsi="Consolas" w:cs="Consolas"/>
@@ -970,6 +1056,7 @@
           <w:rFonts w:ascii="Consolas" w:eastAsia="Consolas" w:hAnsi="Consolas" w:cs="Consolas"/>
         </w:rPr>
       </w:pPr>
+      <w:proofErr w:type="spellStart"/>
       <w:r>
         <w:rPr>
           <w:rFonts w:ascii="Consolas" w:eastAsia="Consolas" w:hAnsi="Consolas" w:cs="Consolas"/>
@@ -977,6 +1064,7 @@
         <w:lastRenderedPageBreak/>
         <w:t>nRep</w:t>
       </w:r>
+      <w:proofErr w:type="spellEnd"/>
       <w:r>
         <w:rPr>
           <w:rFonts w:ascii="Consolas" w:eastAsia="Consolas" w:hAnsi="Consolas" w:cs="Consolas"/>
@@ -1016,7 +1104,15 @@
     </w:p>
     <w:p>
       <w:r>
-        <w:t xml:space="preserve">During the seeding of fibers into the RVE, the RVE can be broken up into squares/cells.  Then the fibers are evenly allocated to each square and placed randomly within the square.  Breaking up the space into squares can affect the cluster size, but can also do a great deal to speed up relaxation, since fibers can be artificially spread out.  </w:t>
+        <w:t xml:space="preserve">During the seeding of fibers into the RVE, the RVE can be broken up into squares/cells.  Then the fibers are evenly allocated to each square and placed randomly within the square.  Breaking up the space into squares can affect the cluster </w:t>
+      </w:r>
+      <w:proofErr w:type="gramStart"/>
+      <w:r>
+        <w:t>size, but</w:t>
+      </w:r>
+      <w:proofErr w:type="gramEnd"/>
+      <w:r>
+        <w:t xml:space="preserve"> can also do a great deal to speed up relaxation, since fibers can be artificially spread out.  </w:t>
       </w:r>
     </w:p>
     <w:p>
@@ -1029,7 +1125,87 @@
     </w:p>
     <w:p>
       <w:r>
-        <w:t>This is in units of number of fibers.  Similar to the nRows, the FPerSquare is actually the square root of the number of fibers that would be in each cell.  So if I had nRows=10 (100 fibers total) and set FPerSquare=5, there would be 4 squares (cells) with 25 fibers in each cell.  If FPerSquare is bigger than the nRows, there will just be one cell/square.  One fiber per cell/square is the default.</w:t>
+        <w:t xml:space="preserve">This is in </w:t>
+      </w:r>
+      <w:proofErr w:type="gramStart"/>
+      <w:r>
+        <w:t>units of number</w:t>
+      </w:r>
+      <w:proofErr w:type="gramEnd"/>
+      <w:r>
+        <w:t xml:space="preserve"> of fibers.  </w:t>
+      </w:r>
+      <w:proofErr w:type="gramStart"/>
+      <w:r>
+        <w:t>Similar to</w:t>
+      </w:r>
+      <w:proofErr w:type="gramEnd"/>
+      <w:r>
+        <w:t xml:space="preserve"> the </w:t>
+      </w:r>
+      <w:proofErr w:type="spellStart"/>
+      <w:r>
+        <w:t>nRows</w:t>
+      </w:r>
+      <w:proofErr w:type="spellEnd"/>
+      <w:r>
+        <w:t xml:space="preserve">, the </w:t>
+      </w:r>
+      <w:proofErr w:type="spellStart"/>
+      <w:r>
+        <w:t>FPerSquare</w:t>
+      </w:r>
+      <w:proofErr w:type="spellEnd"/>
+      <w:r>
+        <w:t xml:space="preserve"> is </w:t>
+      </w:r>
+      <w:proofErr w:type="gramStart"/>
+      <w:r>
+        <w:t>actually the</w:t>
+      </w:r>
+      <w:proofErr w:type="gramEnd"/>
+      <w:r>
+        <w:t xml:space="preserve"> square root of the number of fibers that would be in each cell.  </w:t>
+      </w:r>
+      <w:proofErr w:type="gramStart"/>
+      <w:r>
+        <w:t>So</w:t>
+      </w:r>
+      <w:proofErr w:type="gramEnd"/>
+      <w:r>
+        <w:t xml:space="preserve"> if I had </w:t>
+      </w:r>
+      <w:proofErr w:type="spellStart"/>
+      <w:r>
+        <w:t>nRows</w:t>
+      </w:r>
+      <w:proofErr w:type="spellEnd"/>
+      <w:r>
+        <w:t xml:space="preserve">=10 (100 fibers total) and set </w:t>
+      </w:r>
+      <w:proofErr w:type="spellStart"/>
+      <w:r>
+        <w:t>FPerSquare</w:t>
+      </w:r>
+      <w:proofErr w:type="spellEnd"/>
+      <w:r>
+        <w:t xml:space="preserve">=5, there would be 4 squares (cells) with 25 fibers in each cell.  If </w:t>
+      </w:r>
+      <w:proofErr w:type="spellStart"/>
+      <w:r>
+        <w:t>FPerSquare</w:t>
+      </w:r>
+      <w:proofErr w:type="spellEnd"/>
+      <w:r>
+        <w:t xml:space="preserve"> is bigger than the </w:t>
+      </w:r>
+      <w:proofErr w:type="spellStart"/>
+      <w:r>
+        <w:t>nRows</w:t>
+      </w:r>
+      <w:proofErr w:type="spellEnd"/>
+      <w:r>
+        <w:t>, there will just be one cell/square.  One fiber per cell/square is the default.</w:t>
       </w:r>
     </w:p>
     <w:p>
@@ -1039,12 +1215,14 @@
           <w:rFonts w:ascii="Consolas" w:eastAsia="Consolas" w:hAnsi="Consolas" w:cs="Consolas"/>
         </w:rPr>
       </w:pPr>
+      <w:proofErr w:type="spellStart"/>
       <w:r>
         <w:rPr>
           <w:rFonts w:ascii="Consolas" w:eastAsia="Consolas" w:hAnsi="Consolas" w:cs="Consolas"/>
         </w:rPr>
         <w:t>FPerSquare</w:t>
       </w:r>
+      <w:proofErr w:type="spellEnd"/>
       <w:r>
         <w:rPr>
           <w:rFonts w:ascii="Consolas" w:eastAsia="Consolas" w:hAnsi="Consolas" w:cs="Consolas"/>
@@ -1108,7 +1286,17 @@
     </w:p>
     <w:p>
       <w:r>
-        <w:t>This is unitless, and the actual margin is margin*fiberRadius.  When there are multiple radii, it is the maximum radius.  When the margin is 1, then fibers from adjacent cells will not be touching each other during seeding.  The margin can help to add kinetic energy to the system by crowding the fibers to the center of the square, so that they all push out of the center at high speeds.  0.75 is the default.</w:t>
+        <w:t>This is unitless, and the actual margin is margin*</w:t>
+      </w:r>
+      <w:proofErr w:type="spellStart"/>
+      <w:proofErr w:type="gramStart"/>
+      <w:r>
+        <w:t>fiberRadius</w:t>
+      </w:r>
+      <w:proofErr w:type="spellEnd"/>
+      <w:proofErr w:type="gramEnd"/>
+      <w:r>
+        <w:t>.  When there are multiple radii, it is the maximum radius.  When the margin is 1, then fibers from adjacent cells will not be touching each other during seeding.  The margin can help to add kinetic energy to the system by crowding the fibers to the center of the square, so that they all push out of the center at high speeds.  0.75 is the default.</w:t>
       </w:r>
     </w:p>
     <w:p>
@@ -1198,12 +1386,14 @@
           <w:rFonts w:ascii="Consolas" w:eastAsia="Consolas" w:hAnsi="Consolas" w:cs="Consolas"/>
         </w:rPr>
       </w:pPr>
+      <w:proofErr w:type="spellStart"/>
       <w:r>
         <w:rPr>
           <w:rFonts w:ascii="Consolas" w:eastAsia="Consolas" w:hAnsi="Consolas" w:cs="Consolas"/>
         </w:rPr>
         <w:t>MultipleRadii</w:t>
       </w:r>
+      <w:proofErr w:type="spellEnd"/>
       <w:r>
         <w:rPr>
           <w:rFonts w:ascii="Consolas" w:eastAsia="Consolas" w:hAnsi="Consolas" w:cs="Consolas"/>
@@ -1229,7 +1419,15 @@
         <w:t xml:space="preserve"> the radius of the fiber is based on where it falls within the percentages.  For the example above, 0.0-0.4 would have r=1, 0.4-0.7 would have r=2, 0.7-0.85 would have r=4, and 0.85-1.0 would have r=6.  Because this is a random process, the volume fraction </w:t>
       </w:r>
       <w:r>
-        <w:t>ends up being slightly off, and the boundary is adjusted to fit it exactly.  This may cause a few edge fibers to be slightly past the edge, so care should be taken,</w:t>
+        <w:t xml:space="preserve">ends up being slightly off, and the boundary is adjusted to fit it exactly.  This may cause a few </w:t>
+      </w:r>
+      <w:proofErr w:type="gramStart"/>
+      <w:r>
+        <w:t>edge</w:t>
+      </w:r>
+      <w:proofErr w:type="gramEnd"/>
+      <w:r>
+        <w:t xml:space="preserve"> fibers to be slightly past the edge, so care should be taken,</w:t>
       </w:r>
       <w:r>
         <w:t xml:space="preserve"> especially for smaller RVEs.  The more fibers in the RVE, the </w:t>
@@ -1269,12 +1467,14 @@
           <w:rFonts w:ascii="Consolas" w:eastAsia="Consolas" w:hAnsi="Consolas" w:cs="Consolas"/>
         </w:rPr>
       </w:pPr>
+      <w:proofErr w:type="spellStart"/>
       <w:r>
         <w:rPr>
           <w:rFonts w:ascii="Consolas" w:eastAsia="Consolas" w:hAnsi="Consolas" w:cs="Consolas"/>
         </w:rPr>
         <w:t>MinSpacing</w:t>
       </w:r>
+      <w:proofErr w:type="spellEnd"/>
       <w:r>
         <w:rPr>
           <w:rFonts w:ascii="Consolas" w:eastAsia="Consolas" w:hAnsi="Consolas" w:cs="Consolas"/>
@@ -1344,12 +1544,14 @@
       </w:r>
     </w:p>
     <w:p>
+      <w:proofErr w:type="spellStart"/>
       <w:r>
         <w:rPr>
           <w:rFonts w:ascii="Consolas" w:eastAsia="Consolas" w:hAnsi="Consolas" w:cs="Consolas"/>
         </w:rPr>
         <w:t>ConDamp</w:t>
       </w:r>
+      <w:proofErr w:type="spellEnd"/>
       <w:r>
         <w:rPr>
           <w:rFonts w:ascii="Consolas" w:eastAsia="Consolas" w:hAnsi="Consolas" w:cs="Consolas"/>
@@ -1368,21 +1570,31 @@
     </w:p>
     <w:p>
       <w:r>
-        <w:t>This is the damping coefficient for the movement of an individual fiber.  This slows down the speed of a fiber.  A value of 1 is critical damping, while &gt;1 is overdamped and &lt;1 is underdamped.  Some global damping is almost always needed to keep the simulation from blowing up.  I’ve found that values above 2.0 are in danger of becoming unstable.  Global damping should be used with contact damping to help speed up the fiber settling.  The default value is 1.0.</w:t>
-      </w:r>
-    </w:p>
-    <w:p>
-      <w:pPr>
-        <w:rPr>
-          <w:rFonts w:ascii="Consolas" w:eastAsia="Consolas" w:hAnsi="Consolas" w:cs="Consolas"/>
-        </w:rPr>
-      </w:pPr>
+        <w:t xml:space="preserve">This is the damping coefficient for the movement of an individual fiber.  This slows down the speed of </w:t>
+      </w:r>
+      <w:proofErr w:type="gramStart"/>
+      <w:r>
+        <w:t>a fiber</w:t>
+      </w:r>
+      <w:proofErr w:type="gramEnd"/>
+      <w:r>
+        <w:t>.  A value of 1 is critical damping, while &gt;1 is overdamped and &lt;1 is underdamped.  Some global damping is almost always needed to keep the simulation from blowing up.  I’ve found that values above 2.0 are in danger of becoming unstable.  Global damping should be used with contact damping to help speed up the fiber settling.  The default value is 1.0.</w:t>
+      </w:r>
+    </w:p>
+    <w:p>
+      <w:pPr>
+        <w:rPr>
+          <w:rFonts w:ascii="Consolas" w:eastAsia="Consolas" w:hAnsi="Consolas" w:cs="Consolas"/>
+        </w:rPr>
+      </w:pPr>
+      <w:proofErr w:type="spellStart"/>
       <w:r>
         <w:rPr>
           <w:rFonts w:ascii="Consolas" w:eastAsia="Consolas" w:hAnsi="Consolas" w:cs="Consolas"/>
         </w:rPr>
         <w:t>GlobDamp</w:t>
       </w:r>
+      <w:proofErr w:type="spellEnd"/>
       <w:r>
         <w:rPr>
           <w:rFonts w:ascii="Consolas" w:eastAsia="Consolas" w:hAnsi="Consolas" w:cs="Consolas"/>
@@ -1401,7 +1613,23 @@
     </w:p>
     <w:p>
       <w:r>
-        <w:t xml:space="preserve">This is Global Damping that increases with increasing time steps.  This helps to keep the system from moving around indefinitely and settles the fibers. The global damping coefficient is calculated as 1.0 / IncrDamp * (i - nStepsWithoutDamping), where i is the number of time steps.  </w:t>
+        <w:t xml:space="preserve">This is Global Damping that increases with increasing time steps.  This helps to keep the system from moving around indefinitely and settles the fibers. The global damping coefficient is calculated as 1.0 / </w:t>
+      </w:r>
+      <w:proofErr w:type="spellStart"/>
+      <w:r>
+        <w:t>IncrDamp</w:t>
+      </w:r>
+      <w:proofErr w:type="spellEnd"/>
+      <w:r>
+        <w:t xml:space="preserve"> * (i - </w:t>
+      </w:r>
+      <w:proofErr w:type="spellStart"/>
+      <w:r>
+        <w:t>nStepsWithoutDamping</w:t>
+      </w:r>
+      <w:proofErr w:type="spellEnd"/>
+      <w:r>
+        <w:t xml:space="preserve">), where i is the number of time steps.  </w:t>
       </w:r>
       <w:r>
         <w:t xml:space="preserve">This planes out when the global damping is reached.  </w:t>
@@ -1422,12 +1650,14 @@
           <w:rFonts w:ascii="Consolas" w:eastAsia="Consolas" w:hAnsi="Consolas" w:cs="Consolas"/>
         </w:rPr>
       </w:pPr>
+      <w:proofErr w:type="spellStart"/>
       <w:r>
         <w:rPr>
           <w:rFonts w:ascii="Consolas" w:eastAsia="Consolas" w:hAnsi="Consolas" w:cs="Consolas"/>
         </w:rPr>
         <w:t>IncrDamp</w:t>
       </w:r>
+      <w:proofErr w:type="spellEnd"/>
       <w:r>
         <w:rPr>
           <w:rFonts w:ascii="Consolas" w:eastAsia="Consolas" w:hAnsi="Consolas" w:cs="Consolas"/>
@@ -1453,21 +1683,55 @@
     </w:p>
     <w:p>
       <w:r>
-        <w:t>This control the maximum number of time steps that are allowed during relaxation.  To make sure that the simulation settles and there are very few overlaps, this should be set to something very high, then you can look at the Pack_All file to see how many iterations were actually used for convergence.  I usually set this to 8000 when running final runs, but set it low (1000) when I am experimenting or trying out a new input file.  The default value is 3000.</w:t>
-      </w:r>
-    </w:p>
-    <w:p>
-      <w:pPr>
-        <w:rPr>
-          <w:rFonts w:ascii="Consolas" w:eastAsia="Consolas" w:hAnsi="Consolas" w:cs="Consolas"/>
-        </w:rPr>
-      </w:pPr>
+        <w:t xml:space="preserve">This </w:t>
+      </w:r>
+      <w:proofErr w:type="gramStart"/>
+      <w:r>
+        <w:t>control</w:t>
+      </w:r>
+      <w:proofErr w:type="gramEnd"/>
+      <w:r>
+        <w:t xml:space="preserve"> the maximum number of time steps that are allowed during relaxation.  To make sure that the simulation settles and there are very few overlaps, this should be set to something very high, then you can look at the </w:t>
+      </w:r>
+      <w:proofErr w:type="spellStart"/>
+      <w:r>
+        <w:t>Pack_All</w:t>
+      </w:r>
+      <w:proofErr w:type="spellEnd"/>
+      <w:r>
+        <w:t xml:space="preserve"> file to see how many iterations were </w:t>
+      </w:r>
+      <w:proofErr w:type="gramStart"/>
+      <w:r>
+        <w:t>actually used</w:t>
+      </w:r>
+      <w:proofErr w:type="gramEnd"/>
+      <w:r>
+        <w:t xml:space="preserve"> for convergence.  I usually set this to 8000 when running final </w:t>
+      </w:r>
+      <w:proofErr w:type="gramStart"/>
+      <w:r>
+        <w:t>runs, but</w:t>
+      </w:r>
+      <w:proofErr w:type="gramEnd"/>
+      <w:r>
+        <w:t xml:space="preserve"> set it low (1000) when I am experimenting or trying out a new input file.  The default value is 3000.</w:t>
+      </w:r>
+    </w:p>
+    <w:p>
+      <w:pPr>
+        <w:rPr>
+          <w:rFonts w:ascii="Consolas" w:eastAsia="Consolas" w:hAnsi="Consolas" w:cs="Consolas"/>
+        </w:rPr>
+      </w:pPr>
+      <w:proofErr w:type="spellStart"/>
       <w:r>
         <w:rPr>
           <w:rFonts w:ascii="Consolas" w:eastAsia="Consolas" w:hAnsi="Consolas" w:cs="Consolas"/>
         </w:rPr>
         <w:t>MaxSteps</w:t>
       </w:r>
+      <w:proofErr w:type="spellEnd"/>
       <w:r>
         <w:rPr>
           <w:rFonts w:ascii="Consolas" w:eastAsia="Consolas" w:hAnsi="Consolas" w:cs="Consolas"/>
@@ -1501,12 +1765,14 @@
           <w:rFonts w:ascii="Consolas" w:eastAsia="Consolas" w:hAnsi="Consolas" w:cs="Consolas"/>
         </w:rPr>
       </w:pPr>
+      <w:proofErr w:type="spellStart"/>
       <w:r>
         <w:rPr>
           <w:rFonts w:ascii="Consolas" w:eastAsia="Consolas" w:hAnsi="Consolas" w:cs="Consolas"/>
         </w:rPr>
         <w:t>UndampedSteps</w:t>
       </w:r>
+      <w:proofErr w:type="spellEnd"/>
       <w:r>
         <w:rPr>
           <w:rFonts w:ascii="Consolas" w:eastAsia="Consolas" w:hAnsi="Consolas" w:cs="Consolas"/>
@@ -1540,12 +1806,14 @@
           <w:rFonts w:ascii="Consolas" w:eastAsia="Consolas" w:hAnsi="Consolas" w:cs="Consolas"/>
         </w:rPr>
       </w:pPr>
+      <w:proofErr w:type="spellStart"/>
       <w:r>
         <w:rPr>
           <w:rFonts w:ascii="Consolas" w:eastAsia="Consolas" w:hAnsi="Consolas" w:cs="Consolas"/>
         </w:rPr>
         <w:t>perKECutoff</w:t>
       </w:r>
+      <w:proofErr w:type="spellEnd"/>
       <w:r>
         <w:rPr>
           <w:rFonts w:ascii="Consolas" w:eastAsia="Consolas" w:hAnsi="Consolas" w:cs="Consolas"/>
@@ -1570,21 +1838,52 @@
     </w:p>
     <w:p>
       <w:r>
-        <w:t>This makes nRows actually the number of fibers rather than the square root of the number of fibers.  If this is true and nRows is set to 50, then there will be 50 fibers.  The default value is False.</w:t>
-      </w:r>
-    </w:p>
-    <w:p>
-      <w:pPr>
-        <w:rPr>
-          <w:rFonts w:ascii="Consolas" w:eastAsia="Consolas" w:hAnsi="Consolas" w:cs="Consolas"/>
-        </w:rPr>
-      </w:pPr>
+        <w:t xml:space="preserve">This makes </w:t>
+      </w:r>
+      <w:proofErr w:type="spellStart"/>
+      <w:r>
+        <w:t>nRows</w:t>
+      </w:r>
+      <w:proofErr w:type="spellEnd"/>
+      <w:r>
+        <w:t xml:space="preserve"> </w:t>
+      </w:r>
+      <w:proofErr w:type="gramStart"/>
+      <w:r>
+        <w:t>actually the</w:t>
+      </w:r>
+      <w:proofErr w:type="gramEnd"/>
+      <w:r>
+        <w:t xml:space="preserve"> number of fibers rather than the square root of the number of fibers.  If this is true </w:t>
+      </w:r>
+      <w:proofErr w:type="gramStart"/>
+      <w:r>
+        <w:t xml:space="preserve">and </w:t>
+      </w:r>
+      <w:proofErr w:type="spellStart"/>
+      <w:r>
+        <w:t>nRows</w:t>
+      </w:r>
+      <w:proofErr w:type="spellEnd"/>
+      <w:proofErr w:type="gramEnd"/>
+      <w:r>
+        <w:t xml:space="preserve"> is set to 50, then there will be 50 fibers.  The default value is False.</w:t>
+      </w:r>
+    </w:p>
+    <w:p>
+      <w:pPr>
+        <w:rPr>
+          <w:rFonts w:ascii="Consolas" w:eastAsia="Consolas" w:hAnsi="Consolas" w:cs="Consolas"/>
+        </w:rPr>
+      </w:pPr>
+      <w:proofErr w:type="spellStart"/>
       <w:r>
         <w:rPr>
           <w:rFonts w:ascii="Consolas" w:eastAsia="Consolas" w:hAnsi="Consolas" w:cs="Consolas"/>
         </w:rPr>
         <w:t>IsNRowsActuallyNFibers</w:t>
       </w:r>
+      <w:proofErr w:type="spellEnd"/>
       <w:r>
         <w:rPr>
           <w:rFonts w:ascii="Consolas" w:eastAsia="Consolas" w:hAnsi="Consolas" w:cs="Consolas"/>
@@ -1618,12 +1917,14 @@
           <w:rFonts w:ascii="Consolas" w:eastAsia="Consolas" w:hAnsi="Consolas" w:cs="Consolas"/>
         </w:rPr>
       </w:pPr>
+      <w:proofErr w:type="spellStart"/>
       <w:r>
         <w:rPr>
           <w:rFonts w:ascii="Consolas" w:eastAsia="Consolas" w:hAnsi="Consolas" w:cs="Consolas"/>
         </w:rPr>
         <w:t>RVEHoverW</w:t>
       </w:r>
+      <w:proofErr w:type="spellEnd"/>
       <w:r>
         <w:rPr>
           <w:rFonts w:ascii="Consolas" w:eastAsia="Consolas" w:hAnsi="Consolas" w:cs="Consolas"/>
@@ -1650,33 +1951,127 @@
         <w:pStyle w:val="Heading4"/>
       </w:pPr>
       <w:r>
-        <w:t>Percent of Kinetic Energy Cutoff</w:t>
+        <w:t>RVE Thickness</w:t>
       </w:r>
     </w:p>
     <w:p>
       <w:r>
         <w:lastRenderedPageBreak/>
-        <w:t>This makes nRows actually the number of fibers rather than the square root of the number of fibers.  If this is true and nRows is set to 50, then there will be 50 fibers.  The default value is False.</w:t>
-      </w:r>
-    </w:p>
-    <w:p>
-      <w:pPr>
-        <w:rPr>
-          <w:rFonts w:ascii="Consolas" w:eastAsia="Consolas" w:hAnsi="Consolas" w:cs="Consolas"/>
-        </w:rPr>
-      </w:pPr>
-      <w:r>
-        <w:rPr>
-          <w:rFonts w:ascii="Consolas" w:eastAsia="Consolas" w:hAnsi="Consolas" w:cs="Consolas"/>
-        </w:rPr>
-        <w:t>IsNRowsActuallyNFibers</w:t>
-      </w:r>
-      <w:r>
-        <w:rPr>
-          <w:rFonts w:ascii="Consolas" w:eastAsia="Consolas" w:hAnsi="Consolas" w:cs="Consolas"/>
-        </w:rPr>
-        <w:tab/>
-      </w:r>
+        <w:t>If you define the RVE thickness, then it will take the number of fibers (nrows</w:t>
+      </w:r>
+      <w:r>
+        <w:rPr>
+          <w:vertAlign w:val="superscript"/>
+        </w:rPr>
+        <w:t>2</w:t>
+      </w:r>
+      <w:r>
+        <w:t>), the thickness, and the fiber volume fraction and scale the width accordingly.  This is great for modelling a certain ply depth.</w:t>
+      </w:r>
+    </w:p>
+    <w:p>
+      <w:pPr>
+        <w:rPr>
+          <w:rFonts w:ascii="Consolas" w:eastAsia="Consolas" w:hAnsi="Consolas" w:cs="Consolas"/>
+        </w:rPr>
+      </w:pPr>
+      <w:proofErr w:type="spellStart"/>
+      <w:r>
+        <w:rPr>
+          <w:rFonts w:ascii="Consolas" w:eastAsia="Consolas" w:hAnsi="Consolas" w:cs="Consolas"/>
+        </w:rPr>
+        <w:t>RVEThickness</w:t>
+      </w:r>
+      <w:proofErr w:type="spellEnd"/>
+      <w:r>
+        <w:rPr>
+          <w:rFonts w:ascii="Consolas" w:eastAsia="Consolas" w:hAnsi="Consolas" w:cs="Consolas"/>
+        </w:rPr>
+        <w:tab/>
+      </w:r>
+      <w:r>
+        <w:rPr>
+          <w:rFonts w:ascii="Consolas" w:eastAsia="Consolas" w:hAnsi="Consolas" w:cs="Consolas"/>
+        </w:rPr>
+        <w:tab/>
+      </w:r>
+      <w:r>
+        <w:rPr>
+          <w:rFonts w:ascii="Consolas" w:eastAsia="Consolas" w:hAnsi="Consolas" w:cs="Consolas"/>
+        </w:rPr>
+        <w:t>32</w:t>
+      </w:r>
+    </w:p>
+    <w:p>
+      <w:pPr>
+        <w:pStyle w:val="Heading4"/>
+      </w:pPr>
+      <w:r>
+        <w:t>Do not allow overlaps</w:t>
+      </w:r>
+    </w:p>
+    <w:p>
+      <w:r>
+        <w:t xml:space="preserve">If this option is set to true, it will check for overlaps (contacts) at the end of the </w:t>
+      </w:r>
+      <w:proofErr w:type="gramStart"/>
+      <w:r>
+        <w:t>relaxation, and</w:t>
+      </w:r>
+      <w:proofErr w:type="gramEnd"/>
+      <w:r>
+        <w:t xml:space="preserve"> stop the fibers and re-run the analysis from the current position if there are overlaps.  </w:t>
+      </w:r>
+      <w:r>
+        <w:t xml:space="preserve">If you have </w:t>
+      </w:r>
+      <w:proofErr w:type="gramStart"/>
+      <w:r>
+        <w:t xml:space="preserve">a </w:t>
+      </w:r>
+      <w:proofErr w:type="spellStart"/>
+      <w:r>
+        <w:t>minSpacing</w:t>
+      </w:r>
+      <w:proofErr w:type="spellEnd"/>
+      <w:proofErr w:type="gramEnd"/>
+      <w:r>
+        <w:t xml:space="preserve">, </w:t>
+      </w:r>
+      <w:proofErr w:type="gramStart"/>
+      <w:r>
+        <w:t>this</w:t>
+      </w:r>
+      <w:proofErr w:type="gramEnd"/>
+      <w:r>
+        <w:t xml:space="preserve"> just flags </w:t>
+      </w:r>
+      <w:proofErr w:type="gramStart"/>
+      <w:r>
+        <w:t>overlaps</w:t>
+      </w:r>
+      <w:proofErr w:type="gramEnd"/>
+      <w:r>
+        <w:t xml:space="preserve"> after the radius has been re-adjusted to the original radius.  </w:t>
+      </w:r>
+      <w:r>
+        <w:t>If there are still overlaps after re-running, an exception will be thrown.  This is by default set to false, since many methods allow a slight overlap.</w:t>
+      </w:r>
+    </w:p>
+    <w:p>
+      <w:pPr>
+        <w:rPr>
+          <w:rFonts w:ascii="Consolas" w:eastAsia="Consolas" w:hAnsi="Consolas" w:cs="Consolas"/>
+        </w:rPr>
+      </w:pPr>
+      <w:proofErr w:type="spellStart"/>
+      <w:r>
+        <w:rPr>
+          <w:rFonts w:ascii="Consolas" w:eastAsia="Consolas" w:hAnsi="Consolas" w:cs="Consolas"/>
+        </w:rPr>
+        <w:t>DoNotAllowOverlaps</w:t>
+      </w:r>
+      <w:proofErr w:type="spellEnd"/>
       <w:r>
         <w:rPr>
           <w:rFonts w:ascii="Consolas" w:eastAsia="Consolas" w:hAnsi="Consolas" w:cs="Consolas"/>
@@ -1690,32 +2085,165 @@
         <w:pStyle w:val="Heading4"/>
       </w:pPr>
       <w:r>
-        <w:t>Do not allow overlaps</w:t>
-      </w:r>
-    </w:p>
-    <w:p>
-      <w:r>
-        <w:t xml:space="preserve">If this option is set to true, it will check for overlaps (contacts) at the end of the relaxation, and stop the fibers and re-run the analysis from the current position if there are overlaps.  </w:t>
-      </w:r>
-      <w:r>
-        <w:t xml:space="preserve">If you have a minSpacing, this just flags overlaps after the radius has been re-adjusted to the original radius.  </w:t>
-      </w:r>
-      <w:r>
-        <w:t>If there are still overlaps after re-running, an exception will be thrown.  This is by default set to false, since many methods allow a slight overlap.</w:t>
-      </w:r>
-    </w:p>
-    <w:p>
-      <w:pPr>
-        <w:rPr>
-          <w:rFonts w:ascii="Consolas" w:eastAsia="Consolas" w:hAnsi="Consolas" w:cs="Consolas"/>
-        </w:rPr>
-      </w:pPr>
-      <w:r>
-        <w:rPr>
-          <w:rFonts w:ascii="Consolas" w:eastAsia="Consolas" w:hAnsi="Consolas" w:cs="Consolas"/>
-        </w:rPr>
-        <w:t>DoNotAllowOverlaps</w:t>
-      </w:r>
+        <w:t>Boundary Types</w:t>
+      </w:r>
+    </w:p>
+    <w:p>
+      <w:r>
+        <w:t xml:space="preserve">Boundary types </w:t>
+      </w:r>
+      <w:proofErr w:type="gramStart"/>
+      <w:r>
+        <w:t>indicates</w:t>
+      </w:r>
+      <w:proofErr w:type="gramEnd"/>
+      <w:r>
+        <w:t xml:space="preserve"> what they y and z boundaries are.  The x-boundary is always linear displacements.  The y and z boundaries are periodic by default (p</w:t>
+      </w:r>
+      <w:proofErr w:type="gramStart"/>
+      <w:r>
+        <w:t>), but</w:t>
+      </w:r>
+      <w:proofErr w:type="gramEnd"/>
+      <w:r>
+        <w:t xml:space="preserve"> can be set to solid walls (s).  Separated by a “/”</w:t>
+      </w:r>
+    </w:p>
+    <w:p>
+      <w:pPr>
+        <w:rPr>
+          <w:rFonts w:ascii="Consolas" w:eastAsia="Consolas" w:hAnsi="Consolas" w:cs="Consolas"/>
+        </w:rPr>
+      </w:pPr>
+      <w:r>
+        <w:rPr>
+          <w:rFonts w:ascii="Consolas" w:eastAsia="Consolas" w:hAnsi="Consolas" w:cs="Consolas"/>
+        </w:rPr>
+        <w:t>BoundaryTypes</w:t>
+      </w:r>
+      <w:r>
+        <w:rPr>
+          <w:rFonts w:ascii="Consolas" w:eastAsia="Consolas" w:hAnsi="Consolas" w:cs="Consolas"/>
+        </w:rPr>
+        <w:tab/>
+      </w:r>
+      <w:r>
+        <w:rPr>
+          <w:rFonts w:ascii="Consolas" w:eastAsia="Consolas" w:hAnsi="Consolas" w:cs="Consolas"/>
+        </w:rPr>
+        <w:tab/>
+        <w:t>p/s</w:t>
+      </w:r>
+    </w:p>
+    <w:p>
+      <w:pPr>
+        <w:pStyle w:val="Heading4"/>
+      </w:pPr>
+      <w:r>
+        <w:t>Minimum Boundary Spacing</w:t>
+      </w:r>
+    </w:p>
+    <w:p>
+      <w:r>
+        <w:t>This is an absolute number.  If the boundary is solid, this will cause a buffer around the boundary by the amount indicated.  During the generation phase, the boundary is brought in by the amount given, then corrected after relaxation.</w:t>
+      </w:r>
+    </w:p>
+    <w:p>
+      <w:pPr>
+        <w:rPr>
+          <w:rFonts w:ascii="Consolas" w:eastAsia="Consolas" w:hAnsi="Consolas" w:cs="Consolas"/>
+        </w:rPr>
+      </w:pPr>
+      <w:proofErr w:type="spellStart"/>
+      <w:r>
+        <w:rPr>
+          <w:rFonts w:ascii="Consolas" w:eastAsia="Consolas" w:hAnsi="Consolas" w:cs="Consolas"/>
+        </w:rPr>
+        <w:t>MinBoundarySpacing</w:t>
+      </w:r>
+      <w:proofErr w:type="spellEnd"/>
+      <w:r>
+        <w:rPr>
+          <w:rFonts w:ascii="Consolas" w:eastAsia="Consolas" w:hAnsi="Consolas" w:cs="Consolas"/>
+        </w:rPr>
+        <w:tab/>
+        <w:t>0.2</w:t>
+      </w:r>
+    </w:p>
+    <w:p>
+      <w:pPr>
+        <w:rPr>
+          <w:rFonts w:ascii="Consolas" w:eastAsia="Consolas" w:hAnsi="Consolas" w:cs="Consolas"/>
+        </w:rPr>
+      </w:pPr>
+    </w:p>
+    <w:p>
+      <w:pPr>
+        <w:pStyle w:val="Heading2"/>
+      </w:pPr>
+      <w:r>
+        <w:t>Output Variables</w:t>
+      </w:r>
+    </w:p>
+    <w:p>
+      <w:pPr>
+        <w:pStyle w:val="Heading4"/>
+      </w:pPr>
+      <w:r>
+        <w:t>Save Results</w:t>
+      </w:r>
+    </w:p>
+    <w:p>
+      <w:r>
+        <w:t xml:space="preserve">This saves a .csv file named “nameOfInputFile_Pack_#Rep_All.csv”.  This file saves </w:t>
+      </w:r>
+      <w:proofErr w:type="gramStart"/>
+      <w:r>
+        <w:t>the fiber</w:t>
+      </w:r>
+      <w:proofErr w:type="gramEnd"/>
+      <w:r>
+        <w:t xml:space="preserve"> positions, contacts, homogenized stress/strain, and boundaries at every X time </w:t>
+      </w:r>
+      <w:proofErr w:type="gramStart"/>
+      <w:r>
+        <w:t>steps</w:t>
+      </w:r>
+      <w:proofErr w:type="gramEnd"/>
+      <w:r>
+        <w:t xml:space="preserve"> (X = </w:t>
+      </w:r>
+      <w:proofErr w:type="spellStart"/>
+      <w:r>
+        <w:t>nMaxSteps</w:t>
+      </w:r>
+      <w:proofErr w:type="spellEnd"/>
+      <w:r>
+        <w:t xml:space="preserve">/100).  This can be used with PlotFDEM.exe, either in the “Fiber Only” or “Contact Force Plot” to watch the relaxation simulation.  These are nice to have a good idea of the generation and </w:t>
+      </w:r>
+      <w:proofErr w:type="gramStart"/>
+      <w:r>
+        <w:t>seeding, but</w:t>
+      </w:r>
+      <w:proofErr w:type="gramEnd"/>
+      <w:r>
+        <w:t xml:space="preserve"> can often be large files.  The fibers will be bigger than the final size if the minimum fiber spacing is non-zero.  This file can be used in FDEM to load the packing rather than re-doing the packing.  Default is False.</w:t>
+      </w:r>
+    </w:p>
+    <w:p>
+      <w:pPr>
+        <w:rPr>
+          <w:rFonts w:ascii="Consolas" w:eastAsia="Consolas" w:hAnsi="Consolas" w:cs="Consolas"/>
+        </w:rPr>
+      </w:pPr>
+      <w:proofErr w:type="spellStart"/>
+      <w:r>
+        <w:rPr>
+          <w:rFonts w:ascii="Consolas" w:eastAsia="Consolas" w:hAnsi="Consolas" w:cs="Consolas"/>
+        </w:rPr>
+        <w:t>SaveResults</w:t>
+      </w:r>
+      <w:proofErr w:type="spellEnd"/>
       <w:r>
         <w:rPr>
           <w:rFonts w:ascii="Consolas" w:eastAsia="Consolas" w:hAnsi="Consolas" w:cs="Consolas"/>
@@ -1729,38 +2257,46 @@
         <w:pStyle w:val="Heading4"/>
       </w:pPr>
       <w:r>
-        <w:t>Boundary Types</w:t>
-      </w:r>
-    </w:p>
-    <w:p>
-      <w:r>
-        <w:t>Boundary types indicates what they y and z boundaries are.  The x-boundary is always linear displacements.  The y and z boundaries are periodic by default (p), but can be set to solid walls (s).  Separated by a “/”</w:t>
-      </w:r>
-    </w:p>
-    <w:p>
-      <w:pPr>
-        <w:rPr>
-          <w:rFonts w:ascii="Consolas" w:eastAsia="Consolas" w:hAnsi="Consolas" w:cs="Consolas"/>
-        </w:rPr>
-      </w:pPr>
-      <w:r>
-        <w:rPr>
-          <w:rFonts w:ascii="Consolas" w:eastAsia="Consolas" w:hAnsi="Consolas" w:cs="Consolas"/>
-        </w:rPr>
-        <w:t>BoundaryTypes</w:t>
-      </w:r>
-      <w:r>
-        <w:rPr>
-          <w:rFonts w:ascii="Consolas" w:eastAsia="Consolas" w:hAnsi="Consolas" w:cs="Consolas"/>
-        </w:rPr>
-        <w:tab/>
-      </w:r>
-      <w:r>
-        <w:rPr>
-          <w:rFonts w:ascii="Consolas" w:eastAsia="Consolas" w:hAnsi="Consolas" w:cs="Consolas"/>
-        </w:rPr>
-        <w:tab/>
-        <w:t>p/s</w:t>
+        <w:t>Save Final Positions</w:t>
+      </w:r>
+    </w:p>
+    <w:p>
+      <w:r>
+        <w:lastRenderedPageBreak/>
+        <w:t xml:space="preserve">This saves a .csv file named “nameOfInputFile_Pack_#Rep.csv”.  This file saves the fiber positions and radius at </w:t>
+      </w:r>
+      <w:proofErr w:type="gramStart"/>
+      <w:r>
+        <w:t>the  end</w:t>
+      </w:r>
+      <w:proofErr w:type="gramEnd"/>
+      <w:r>
+        <w:t xml:space="preserve"> of the relaxation simulation.  This is the </w:t>
+      </w:r>
+      <w:proofErr w:type="gramStart"/>
+      <w:r>
+        <w:t>best for using</w:t>
+      </w:r>
+      <w:proofErr w:type="gramEnd"/>
+      <w:r>
+        <w:t xml:space="preserve"> the results elsewhere.  Default is False.</w:t>
+      </w:r>
+    </w:p>
+    <w:p>
+      <w:proofErr w:type="spellStart"/>
+      <w:r>
+        <w:rPr>
+          <w:rFonts w:ascii="Consolas" w:eastAsia="Consolas" w:hAnsi="Consolas" w:cs="Consolas"/>
+        </w:rPr>
+        <w:t>SaveFinalPositions</w:t>
+      </w:r>
+      <w:proofErr w:type="spellEnd"/>
+      <w:r>
+        <w:rPr>
+          <w:rFonts w:ascii="Consolas" w:eastAsia="Consolas" w:hAnsi="Consolas" w:cs="Consolas"/>
+        </w:rPr>
+        <w:tab/>
+        <w:t>True</w:t>
       </w:r>
     </w:p>
     <w:p>
@@ -1768,122 +2304,28 @@
         <w:pStyle w:val="Heading4"/>
       </w:pPr>
       <w:r>
-        <w:t>Minimum Boundary Spacing</w:t>
-      </w:r>
-    </w:p>
-    <w:p>
-      <w:r>
-        <w:t>This is an absolute number.  If the boundary is solid, this will cause a buffer around the boundary by the amount indicated.  During the generation phase, the boundary is brought in by the amount given, then corrected after relaxation.</w:t>
-      </w:r>
-    </w:p>
-    <w:p>
-      <w:pPr>
-        <w:rPr>
-          <w:rFonts w:ascii="Consolas" w:eastAsia="Consolas" w:hAnsi="Consolas" w:cs="Consolas"/>
-        </w:rPr>
-      </w:pPr>
-      <w:r>
-        <w:rPr>
-          <w:rFonts w:ascii="Consolas" w:eastAsia="Consolas" w:hAnsi="Consolas" w:cs="Consolas"/>
-        </w:rPr>
-        <w:t>MinBoundarySpacing</w:t>
-      </w:r>
-      <w:r>
-        <w:rPr>
-          <w:rFonts w:ascii="Consolas" w:eastAsia="Consolas" w:hAnsi="Consolas" w:cs="Consolas"/>
-        </w:rPr>
-        <w:tab/>
-        <w:t>0.2</w:t>
-      </w:r>
-    </w:p>
-    <w:p>
-      <w:pPr>
-        <w:rPr>
-          <w:rFonts w:ascii="Consolas" w:eastAsia="Consolas" w:hAnsi="Consolas" w:cs="Consolas"/>
-        </w:rPr>
-      </w:pPr>
-    </w:p>
-    <w:p>
-      <w:pPr>
-        <w:pStyle w:val="Heading2"/>
-      </w:pPr>
-      <w:r>
-        <w:t>Output Variables</w:t>
-      </w:r>
-    </w:p>
-    <w:p>
-      <w:pPr>
-        <w:pStyle w:val="Heading4"/>
-      </w:pPr>
-      <w:r>
-        <w:t>Save Results</w:t>
-      </w:r>
-    </w:p>
-    <w:p>
-      <w:r>
-        <w:t>This saves a .csv file named “nameOfInputFile_Pack_#Rep_All.csv”.  This file saves the fiber positions, contacts, homogenized stress/strain, and boundaries at every X time steps (X = nMaxSteps/100).  This can be used with PlotFDEM.exe, either in the “Fiber Only” or “Contact Force Plot” to watch the relaxation simulation.  These are nice to have a good idea of the generation and seeding, but can often be large files.  The fibers will be bigger than the final size if the minimum fiber spacing is non-zero.  This file can be used in FDEM to load the packing rather than re-doing the packing.  Default is False.</w:t>
-      </w:r>
-    </w:p>
-    <w:p>
-      <w:pPr>
-        <w:rPr>
-          <w:rFonts w:ascii="Consolas" w:eastAsia="Consolas" w:hAnsi="Consolas" w:cs="Consolas"/>
-        </w:rPr>
-      </w:pPr>
-      <w:r>
-        <w:rPr>
-          <w:rFonts w:ascii="Consolas" w:eastAsia="Consolas" w:hAnsi="Consolas" w:cs="Consolas"/>
-        </w:rPr>
-        <w:t>SaveResults</w:t>
-      </w:r>
-      <w:r>
-        <w:rPr>
-          <w:rFonts w:ascii="Consolas" w:eastAsia="Consolas" w:hAnsi="Consolas" w:cs="Consolas"/>
-        </w:rPr>
-        <w:tab/>
-        <w:t>True</w:t>
-      </w:r>
-    </w:p>
-    <w:p>
-      <w:pPr>
-        <w:pStyle w:val="Heading4"/>
-      </w:pPr>
-      <w:r>
-        <w:t>Save Final Positions</w:t>
-      </w:r>
-    </w:p>
-    <w:p>
-      <w:r>
-        <w:lastRenderedPageBreak/>
-        <w:t>This saves a .csv file named “nameOfInputFile_Pack_#Rep.csv”.  This file saves the fiber positions and radius at the  end of the relaxation simulation.  This is the best for using the results elsewhere.  Default is False.</w:t>
-      </w:r>
-    </w:p>
-    <w:p>
-      <w:r>
-        <w:rPr>
-          <w:rFonts w:ascii="Consolas" w:eastAsia="Consolas" w:hAnsi="Consolas" w:cs="Consolas"/>
-        </w:rPr>
-        <w:t>SaveFinalPositions</w:t>
-      </w:r>
-      <w:r>
-        <w:rPr>
-          <w:rFonts w:ascii="Consolas" w:eastAsia="Consolas" w:hAnsi="Consolas" w:cs="Consolas"/>
-        </w:rPr>
-        <w:tab/>
-        <w:t>True</w:t>
-      </w:r>
-    </w:p>
-    <w:p>
-      <w:pPr>
-        <w:pStyle w:val="Heading4"/>
-      </w:pPr>
-      <w:r>
         <w:t>Save Final Positions Without Projections</w:t>
       </w:r>
     </w:p>
     <w:p>
       <w:r>
-        <w:t>This saves a .csv file named “nameOfInputFile_Pack_#Rep.csv”.  This file saves the fiber positions and radius at the  end of the relaxation simulation, but does not include the projected fibers.  The projected fibers are what give the RVE their periodicity. I don’t remember what case I needed this for</w:t>
+        <w:t xml:space="preserve">This saves a .csv file named “nameOfInputFile_Pack_#Rep.csv”.  This file saves the fiber positions and radius at </w:t>
+      </w:r>
+      <w:proofErr w:type="gramStart"/>
+      <w:r>
+        <w:t>the  end</w:t>
+      </w:r>
+      <w:proofErr w:type="gramEnd"/>
+      <w:r>
+        <w:t xml:space="preserve"> of the relaxation </w:t>
+      </w:r>
+      <w:proofErr w:type="gramStart"/>
+      <w:r>
+        <w:t>simulation, but</w:t>
+      </w:r>
+      <w:proofErr w:type="gramEnd"/>
+      <w:r>
+        <w:t xml:space="preserve"> does not include the projected fibers.  The projected fibers are what give the RVE their periodicity. I don’t remember what case I needed this for</w:t>
       </w:r>
       <w:r>
         <w:rPr>
@@ -1901,12 +2343,14 @@
           <w:rFonts w:ascii="Consolas" w:eastAsia="Consolas" w:hAnsi="Consolas" w:cs="Consolas"/>
         </w:rPr>
       </w:pPr>
+      <w:proofErr w:type="spellStart"/>
       <w:r>
         <w:rPr>
           <w:rFonts w:ascii="Consolas" w:eastAsia="Consolas" w:hAnsi="Consolas" w:cs="Consolas"/>
         </w:rPr>
         <w:t>SaveFinalPositionsWithoutProjections</w:t>
       </w:r>
+      <w:proofErr w:type="spellEnd"/>
       <w:r>
         <w:rPr>
           <w:rFonts w:ascii="Consolas" w:eastAsia="Consolas" w:hAnsi="Consolas" w:cs="Consolas"/>
@@ -1928,21 +2372,31 @@
     </w:p>
     <w:p>
       <w:r>
-        <w:t>This saves the mean, IQR (Inter-quartile region) and kurtosis of the distribution of local fiber volume fractions in an output file.  It goes in the same _Pack file as the others, and is placed at the end.  Default is False.</w:t>
-      </w:r>
-    </w:p>
-    <w:p>
-      <w:pPr>
-        <w:rPr>
-          <w:rFonts w:ascii="Consolas" w:eastAsia="Consolas" w:hAnsi="Consolas" w:cs="Consolas"/>
-        </w:rPr>
-      </w:pPr>
+        <w:t xml:space="preserve">This saves the mean, IQR (Inter-quartile region) and kurtosis of the distribution of local fiber volume fractions in an output file.  It goes in the same _Pack file as the </w:t>
+      </w:r>
+      <w:proofErr w:type="gramStart"/>
+      <w:r>
+        <w:t>others, and</w:t>
+      </w:r>
+      <w:proofErr w:type="gramEnd"/>
+      <w:r>
+        <w:t xml:space="preserve"> is placed at the end.  Default is False.</w:t>
+      </w:r>
+    </w:p>
+    <w:p>
+      <w:pPr>
+        <w:rPr>
+          <w:rFonts w:ascii="Consolas" w:eastAsia="Consolas" w:hAnsi="Consolas" w:cs="Consolas"/>
+        </w:rPr>
+      </w:pPr>
+      <w:proofErr w:type="spellStart"/>
       <w:r>
         <w:rPr>
           <w:rFonts w:ascii="Consolas" w:eastAsia="Consolas" w:hAnsi="Consolas" w:cs="Consolas"/>
         </w:rPr>
         <w:t>SaveVfStatistics</w:t>
       </w:r>
+      <w:proofErr w:type="spellEnd"/>
       <w:r>
         <w:rPr>
           <w:rFonts w:ascii="Consolas" w:eastAsia="Consolas" w:hAnsi="Consolas" w:cs="Consolas"/>
@@ -1964,16 +2418,34 @@
     </w:p>
     <w:p>
       <w:r>
-        <w:t>This is only active when SaveVfStatistics is true, but it outputs a connection plot, which plots the triangulation using PlotFDEM.  This is the triangulation used both for the volume fraction data, but also for the identification of fiber pairs when a matrix model is applied.</w:t>
-      </w:r>
-    </w:p>
-    <w:p>
+        <w:t xml:space="preserve">This is only active when </w:t>
+      </w:r>
+      <w:proofErr w:type="spellStart"/>
+      <w:r>
+        <w:t>SaveVfStatistics</w:t>
+      </w:r>
+      <w:proofErr w:type="spellEnd"/>
+      <w:r>
+        <w:t xml:space="preserve"> is true, but it outputs a connection plot, which plots the triangulation using </w:t>
+      </w:r>
+      <w:proofErr w:type="spellStart"/>
+      <w:r>
+        <w:t>PlotFDEM</w:t>
+      </w:r>
+      <w:proofErr w:type="spellEnd"/>
+      <w:r>
+        <w:t>.  This is the triangulation used both for the volume fraction data, but also for the identification of fiber pairs when a matrix model is applied.</w:t>
+      </w:r>
+    </w:p>
+    <w:p>
+      <w:proofErr w:type="spellStart"/>
       <w:r>
         <w:rPr>
           <w:rFonts w:ascii="Consolas" w:eastAsia="Consolas" w:hAnsi="Consolas" w:cs="Consolas"/>
         </w:rPr>
         <w:t>SaveConnectionPlot</w:t>
       </w:r>
+      <w:proofErr w:type="spellEnd"/>
       <w:r>
         <w:rPr>
           <w:rFonts w:ascii="Consolas" w:eastAsia="Consolas" w:hAnsi="Consolas" w:cs="Consolas"/>
@@ -2140,12 +2612,28 @@
     </w:p>
     <w:p>
       <w:r>
-        <w:t>All variables should be private, with public get/set properties which call on the private properties when needed.</w:t>
-      </w:r>
-    </w:p>
-    <w:p>
-      <w:r>
-        <w:t>Private variables generally lowercase, while public are uppercase with the same name.  All methods are uppercase. Use CamelCase for all variables.</w:t>
+        <w:t xml:space="preserve">All variables should be private, with public get/set properties which call on the private </w:t>
+      </w:r>
+      <w:proofErr w:type="gramStart"/>
+      <w:r>
+        <w:t>properties</w:t>
+      </w:r>
+      <w:proofErr w:type="gramEnd"/>
+      <w:r>
+        <w:t xml:space="preserve"> when needed.</w:t>
+      </w:r>
+    </w:p>
+    <w:p>
+      <w:r>
+        <w:t xml:space="preserve">Private variables generally lowercase, while public </w:t>
+      </w:r>
+      <w:proofErr w:type="gramStart"/>
+      <w:r>
+        <w:t>are</w:t>
+      </w:r>
+      <w:proofErr w:type="gramEnd"/>
+      <w:r>
+        <w:t xml:space="preserve"> uppercase with the same name.  All methods are uppercase. Use CamelCase for all variables.</w:t>
       </w:r>
     </w:p>
     <w:p>
@@ -2166,7 +2654,31 @@
     </w:p>
     <w:p>
       <w:r>
-        <w:t>You can run RandomRVEGenerator from the commandline and pass in arguments.  The arguments can be a file name (with full or relative path) or a directory (with full or relative path).  If it’s a directory, it’ll try to run all .txt files in the directory.  You can separate directories with a space.  Like this:</w:t>
+        <w:t xml:space="preserve">You can run </w:t>
+      </w:r>
+      <w:proofErr w:type="spellStart"/>
+      <w:r>
+        <w:t>RandomRVEGenerator</w:t>
+      </w:r>
+      <w:proofErr w:type="spellEnd"/>
+      <w:r>
+        <w:t xml:space="preserve"> from the </w:t>
+      </w:r>
+      <w:proofErr w:type="spellStart"/>
+      <w:r>
+        <w:t>commandline</w:t>
+      </w:r>
+      <w:proofErr w:type="spellEnd"/>
+      <w:r>
+        <w:t xml:space="preserve"> and pass in arguments.  The arguments can be a file name (with full or relative path) or a directory (with full or relative path).  If it’s a directory, it’ll try to run all .txt files in the directory.  You can separate directories with </w:t>
+      </w:r>
+      <w:proofErr w:type="gramStart"/>
+      <w:r>
+        <w:t>a space</w:t>
+      </w:r>
+      <w:proofErr w:type="gramEnd"/>
+      <w:r>
+        <w:t>.  Like this:</w:t>
       </w:r>
     </w:p>
     <w:p>

</xml_diff>

<commit_message>
Allow user to give 2.5 or 2 D elements.  Fixed uneven nodes on crossply.
</commit_message>
<xml_diff>
--- a/RandomRVEGenerator/RandomRVEGenerator_UsersManual.docx
+++ b/RandomRVEGenerator/RandomRVEGenerator_UsersManual.docx
@@ -25,15 +25,7 @@
     </w:p>
     <w:p>
       <w:r>
-        <w:t xml:space="preserve">Husseini, J.F., Pineda, E.J., Stapleton, S.E., “Generation of artificial 2-D fiber reinforced composite microstructures with statistically equivalent features” Composite Part A: Applied Science and Manufacturing, Vol. 164, 2023. </w:t>
-      </w:r>
-      <w:proofErr w:type="spellStart"/>
-      <w:r>
-        <w:t>doi</w:t>
-      </w:r>
-      <w:proofErr w:type="spellEnd"/>
-      <w:r>
-        <w:t>: 10.1016/j.compositesa.2022.107260</w:t>
+        <w:t>Husseini, J.F., Pineda, E.J., Stapleton, S.E., “Generation of artificial 2-D fiber reinforced composite microstructures with statistically equivalent features” Composite Part A: Applied Science and Manufacturing, Vol. 164, 2023. doi: 10.1016/j.compositesa.2022.107260</w:t>
       </w:r>
     </w:p>
     <w:p>
@@ -51,23 +43,7 @@
     </w:p>
     <w:p>
       <w:r>
-        <w:t>General format: program is run via text input files.  Output can be requested in the form of .csv files with fiber positions/</w:t>
-      </w:r>
-      <w:proofErr w:type="gramStart"/>
-      <w:r>
-        <w:t>radii</w:t>
-      </w:r>
-      <w:proofErr w:type="gramEnd"/>
-      <w:r>
-        <w:t xml:space="preserve"> only or a file of the generation process to be read by </w:t>
-      </w:r>
-      <w:proofErr w:type="spellStart"/>
-      <w:r>
-        <w:t>PlotFDEM</w:t>
-      </w:r>
-      <w:proofErr w:type="spellEnd"/>
-      <w:r>
-        <w:t xml:space="preserve"> (_all).  </w:t>
+        <w:t xml:space="preserve">General format: program is run via text input files.  Output can be requested in the form of .csv files with fiber positions/radii only or a file of the generation process to be read by PlotFDEM (_all).  </w:t>
       </w:r>
     </w:p>
     <w:p>
@@ -219,14 +195,12 @@
           <w:rFonts w:ascii="Consolas" w:eastAsia="Consolas" w:hAnsi="Consolas" w:cs="Consolas"/>
         </w:rPr>
       </w:pPr>
-      <w:proofErr w:type="spellStart"/>
       <w:r>
         <w:rPr>
           <w:rFonts w:ascii="Consolas" w:eastAsia="Consolas" w:hAnsi="Consolas" w:cs="Consolas"/>
         </w:rPr>
         <w:t>Vf</w:t>
       </w:r>
-      <w:proofErr w:type="spellEnd"/>
       <w:r>
         <w:rPr>
           <w:rFonts w:ascii="Consolas" w:eastAsia="Consolas" w:hAnsi="Consolas" w:cs="Consolas"/>
@@ -255,14 +229,12 @@
           <w:rFonts w:ascii="Consolas" w:eastAsia="Consolas" w:hAnsi="Consolas" w:cs="Consolas"/>
         </w:rPr>
       </w:pPr>
-      <w:proofErr w:type="spellStart"/>
       <w:r>
         <w:rPr>
           <w:rFonts w:ascii="Consolas" w:eastAsia="Consolas" w:hAnsi="Consolas" w:cs="Consolas"/>
         </w:rPr>
         <w:t>nRows</w:t>
       </w:r>
-      <w:proofErr w:type="spellEnd"/>
       <w:r>
         <w:rPr>
           <w:rFonts w:ascii="Consolas" w:eastAsia="Consolas" w:hAnsi="Consolas" w:cs="Consolas"/>
@@ -291,14 +263,12 @@
           <w:rFonts w:ascii="Consolas" w:eastAsia="Consolas" w:hAnsi="Consolas" w:cs="Consolas"/>
         </w:rPr>
       </w:pPr>
-      <w:proofErr w:type="spellStart"/>
       <w:r>
         <w:rPr>
           <w:rFonts w:ascii="Consolas" w:eastAsia="Consolas" w:hAnsi="Consolas" w:cs="Consolas"/>
         </w:rPr>
         <w:t>nRep</w:t>
       </w:r>
-      <w:proofErr w:type="spellEnd"/>
       <w:r>
         <w:rPr>
           <w:rFonts w:ascii="Consolas" w:eastAsia="Consolas" w:hAnsi="Consolas" w:cs="Consolas"/>
@@ -369,14 +339,12 @@
           <w:rFonts w:ascii="Consolas" w:eastAsia="Consolas" w:hAnsi="Consolas" w:cs="Consolas"/>
         </w:rPr>
       </w:pPr>
-      <w:proofErr w:type="spellStart"/>
       <w:r>
         <w:rPr>
           <w:rFonts w:ascii="Consolas" w:eastAsia="Consolas" w:hAnsi="Consolas" w:cs="Consolas"/>
         </w:rPr>
         <w:t>MinSpacing</w:t>
       </w:r>
-      <w:proofErr w:type="spellEnd"/>
       <w:r>
         <w:rPr>
           <w:rFonts w:ascii="Consolas" w:eastAsia="Consolas" w:hAnsi="Consolas" w:cs="Consolas"/>
@@ -392,14 +360,12 @@
           <w:rFonts w:ascii="Consolas" w:eastAsia="Consolas" w:hAnsi="Consolas" w:cs="Consolas"/>
         </w:rPr>
       </w:pPr>
-      <w:proofErr w:type="spellStart"/>
       <w:r>
         <w:rPr>
           <w:rFonts w:ascii="Consolas" w:eastAsia="Consolas" w:hAnsi="Consolas" w:cs="Consolas"/>
         </w:rPr>
         <w:t>FPerSquare</w:t>
       </w:r>
-      <w:proofErr w:type="spellEnd"/>
       <w:r>
         <w:rPr>
           <w:rFonts w:ascii="Consolas" w:eastAsia="Consolas" w:hAnsi="Consolas" w:cs="Consolas"/>
@@ -436,14 +402,12 @@
           <w:rFonts w:ascii="Consolas" w:eastAsia="Consolas" w:hAnsi="Consolas" w:cs="Consolas"/>
         </w:rPr>
       </w:pPr>
-      <w:proofErr w:type="spellStart"/>
       <w:r>
         <w:rPr>
           <w:rFonts w:ascii="Consolas" w:eastAsia="Consolas" w:hAnsi="Consolas" w:cs="Consolas"/>
         </w:rPr>
         <w:t>ConDamp</w:t>
       </w:r>
-      <w:proofErr w:type="spellEnd"/>
       <w:r>
         <w:rPr>
           <w:rFonts w:ascii="Consolas" w:eastAsia="Consolas" w:hAnsi="Consolas" w:cs="Consolas"/>
@@ -459,14 +423,12 @@
           <w:rFonts w:ascii="Consolas" w:eastAsia="Consolas" w:hAnsi="Consolas" w:cs="Consolas"/>
         </w:rPr>
       </w:pPr>
-      <w:proofErr w:type="spellStart"/>
       <w:r>
         <w:rPr>
           <w:rFonts w:ascii="Consolas" w:eastAsia="Consolas" w:hAnsi="Consolas" w:cs="Consolas"/>
         </w:rPr>
         <w:t>GlobDamp</w:t>
       </w:r>
-      <w:proofErr w:type="spellEnd"/>
       <w:r>
         <w:rPr>
           <w:rFonts w:ascii="Consolas" w:eastAsia="Consolas" w:hAnsi="Consolas" w:cs="Consolas"/>
@@ -482,14 +444,12 @@
           <w:rFonts w:ascii="Consolas" w:eastAsia="Consolas" w:hAnsi="Consolas" w:cs="Consolas"/>
         </w:rPr>
       </w:pPr>
-      <w:proofErr w:type="spellStart"/>
       <w:r>
         <w:rPr>
           <w:rFonts w:ascii="Consolas" w:eastAsia="Consolas" w:hAnsi="Consolas" w:cs="Consolas"/>
         </w:rPr>
         <w:t>MaxSteps</w:t>
       </w:r>
-      <w:proofErr w:type="spellEnd"/>
       <w:r>
         <w:rPr>
           <w:rFonts w:ascii="Consolas" w:eastAsia="Consolas" w:hAnsi="Consolas" w:cs="Consolas"/>
@@ -505,14 +465,12 @@
           <w:rFonts w:ascii="Consolas" w:eastAsia="Consolas" w:hAnsi="Consolas" w:cs="Consolas"/>
         </w:rPr>
       </w:pPr>
-      <w:proofErr w:type="spellStart"/>
       <w:r>
         <w:rPr>
           <w:rFonts w:ascii="Consolas" w:eastAsia="Consolas" w:hAnsi="Consolas" w:cs="Consolas"/>
         </w:rPr>
         <w:t>UndampedSteps</w:t>
       </w:r>
-      <w:proofErr w:type="spellEnd"/>
       <w:r>
         <w:rPr>
           <w:rFonts w:ascii="Consolas" w:eastAsia="Consolas" w:hAnsi="Consolas" w:cs="Consolas"/>
@@ -528,7 +486,6 @@
           <w:rFonts w:ascii="Consolas" w:eastAsia="Consolas" w:hAnsi="Consolas" w:cs="Consolas"/>
         </w:rPr>
       </w:pPr>
-      <w:proofErr w:type="spellStart"/>
       <w:r>
         <w:rPr>
           <w:rFonts w:ascii="Consolas" w:eastAsia="Consolas" w:hAnsi="Consolas" w:cs="Consolas"/>
@@ -536,7 +493,6 @@
         <w:lastRenderedPageBreak/>
         <w:t>SaveFinalPositions</w:t>
       </w:r>
-      <w:proofErr w:type="spellEnd"/>
       <w:r>
         <w:rPr>
           <w:rFonts w:ascii="Consolas" w:eastAsia="Consolas" w:hAnsi="Consolas" w:cs="Consolas"/>
@@ -552,14 +508,12 @@
           <w:rFonts w:ascii="Consolas" w:eastAsia="Consolas" w:hAnsi="Consolas" w:cs="Consolas"/>
         </w:rPr>
       </w:pPr>
-      <w:proofErr w:type="spellStart"/>
       <w:r>
         <w:rPr>
           <w:rFonts w:ascii="Consolas" w:eastAsia="Consolas" w:hAnsi="Consolas" w:cs="Consolas"/>
         </w:rPr>
         <w:t>SaveResults</w:t>
       </w:r>
-      <w:proofErr w:type="spellEnd"/>
       <w:r>
         <w:rPr>
           <w:rFonts w:ascii="Consolas" w:eastAsia="Consolas" w:hAnsi="Consolas" w:cs="Consolas"/>
@@ -575,14 +529,12 @@
           <w:rFonts w:ascii="Consolas" w:eastAsia="Consolas" w:hAnsi="Consolas" w:cs="Consolas"/>
         </w:rPr>
       </w:pPr>
-      <w:proofErr w:type="spellStart"/>
       <w:r>
         <w:rPr>
           <w:rFonts w:ascii="Consolas" w:eastAsia="Consolas" w:hAnsi="Consolas" w:cs="Consolas"/>
         </w:rPr>
         <w:t>MultipleRadii</w:t>
       </w:r>
-      <w:proofErr w:type="spellEnd"/>
       <w:r>
         <w:rPr>
           <w:rFonts w:ascii="Consolas" w:eastAsia="Consolas" w:hAnsi="Consolas" w:cs="Consolas"/>
@@ -598,14 +550,12 @@
           <w:rFonts w:ascii="Consolas" w:eastAsia="Consolas" w:hAnsi="Consolas" w:cs="Consolas"/>
         </w:rPr>
       </w:pPr>
-      <w:proofErr w:type="spellStart"/>
       <w:r>
         <w:rPr>
           <w:rFonts w:ascii="Consolas" w:eastAsia="Consolas" w:hAnsi="Consolas" w:cs="Consolas"/>
         </w:rPr>
         <w:t>DoNotAllowOverlaps</w:t>
       </w:r>
-      <w:proofErr w:type="spellEnd"/>
       <w:r>
         <w:rPr>
           <w:rFonts w:ascii="Consolas" w:eastAsia="Consolas" w:hAnsi="Consolas" w:cs="Consolas"/>
@@ -642,14 +592,12 @@
           <w:rFonts w:ascii="Consolas" w:eastAsia="Consolas" w:hAnsi="Consolas" w:cs="Consolas"/>
         </w:rPr>
       </w:pPr>
-      <w:proofErr w:type="spellStart"/>
       <w:r>
         <w:rPr>
           <w:rFonts w:ascii="Consolas" w:eastAsia="Consolas" w:hAnsi="Consolas" w:cs="Consolas"/>
         </w:rPr>
         <w:t>MinBoundarySpacing</w:t>
       </w:r>
-      <w:proofErr w:type="spellEnd"/>
       <w:r>
         <w:rPr>
           <w:rFonts w:ascii="Consolas" w:eastAsia="Consolas" w:hAnsi="Consolas" w:cs="Consolas"/>
@@ -683,21 +631,7 @@
         <w:rPr>
           <w:rFonts w:ascii="Consolas" w:eastAsia="Consolas" w:hAnsi="Consolas" w:cs="Consolas"/>
         </w:rPr>
-        <w:t xml:space="preserve">** Separate option name and value with one tab.  Use True/False for </w:t>
-      </w:r>
-      <w:proofErr w:type="spellStart"/>
-      <w:r>
-        <w:rPr>
-          <w:rFonts w:ascii="Consolas" w:eastAsia="Consolas" w:hAnsi="Consolas" w:cs="Consolas"/>
-        </w:rPr>
-        <w:t>booleans</w:t>
-      </w:r>
-      <w:proofErr w:type="spellEnd"/>
-      <w:r>
-        <w:rPr>
-          <w:rFonts w:ascii="Consolas" w:eastAsia="Consolas" w:hAnsi="Consolas" w:cs="Consolas"/>
-        </w:rPr>
-        <w:t>.</w:t>
+        <w:t>** Separate option name and value with one tab.  Use True/False for booleans.</w:t>
       </w:r>
     </w:p>
     <w:p>
@@ -889,15 +823,7 @@
     </w:p>
     <w:p>
       <w:r>
-        <w:t xml:space="preserve">This is the radius of the fiber.  Normally this is in micrometers, but units can be whatever the user would like, as long as it’s consistent.  If there are multiple </w:t>
-      </w:r>
-      <w:proofErr w:type="gramStart"/>
-      <w:r>
-        <w:t>radii</w:t>
-      </w:r>
-      <w:proofErr w:type="gramEnd"/>
-      <w:r>
-        <w:t xml:space="preserve"> or a radius distribution is used, this value is replaced, but something must be here, nonetheless.</w:t>
+        <w:t>This is the radius of the fiber.  Normally this is in micrometers, but units can be whatever the user would like, as long as it’s consistent.  If there are multiple radii or a radius distribution is used, this value is replaced, but something must be here, nonetheless.</w:t>
       </w:r>
     </w:p>
     <w:p>
@@ -952,14 +878,12 @@
           <w:rFonts w:ascii="Consolas" w:eastAsia="Consolas" w:hAnsi="Consolas" w:cs="Consolas"/>
         </w:rPr>
       </w:pPr>
-      <w:proofErr w:type="spellStart"/>
       <w:r>
         <w:rPr>
           <w:rFonts w:ascii="Consolas" w:eastAsia="Consolas" w:hAnsi="Consolas" w:cs="Consolas"/>
         </w:rPr>
         <w:t>Vf</w:t>
       </w:r>
-      <w:proofErr w:type="spellEnd"/>
       <w:r>
         <w:rPr>
           <w:rFonts w:ascii="Consolas" w:eastAsia="Consolas" w:hAnsi="Consolas" w:cs="Consolas"/>
@@ -991,31 +915,21 @@
     </w:p>
     <w:p>
       <w:r>
-        <w:t>This is the square root of the total number of fibers.  The number of fibers is dictated this way because hexagonal packing was the first packing implemented, and for that packing the number of rows is a more relevant metric.  Options can be chosen to make this the number of fibers instead (</w:t>
-      </w:r>
-      <w:proofErr w:type="spellStart"/>
-      <w:r>
-        <w:t>IsNRowsActualltNFibers</w:t>
-      </w:r>
-      <w:proofErr w:type="spellEnd"/>
-      <w:r>
-        <w:t>)</w:t>
-      </w:r>
-    </w:p>
-    <w:p>
-      <w:pPr>
-        <w:rPr>
-          <w:rFonts w:ascii="Consolas" w:eastAsia="Consolas" w:hAnsi="Consolas" w:cs="Consolas"/>
-        </w:rPr>
-      </w:pPr>
-      <w:proofErr w:type="spellStart"/>
+        <w:t>This is the square root of the total number of fibers.  The number of fibers is dictated this way because hexagonal packing was the first packing implemented, and for that packing the number of rows is a more relevant metric.  Options can be chosen to make this the number of fibers instead (IsNRowsActualltNFibers)</w:t>
+      </w:r>
+    </w:p>
+    <w:p>
+      <w:pPr>
+        <w:rPr>
+          <w:rFonts w:ascii="Consolas" w:eastAsia="Consolas" w:hAnsi="Consolas" w:cs="Consolas"/>
+        </w:rPr>
+      </w:pPr>
       <w:r>
         <w:rPr>
           <w:rFonts w:ascii="Consolas" w:eastAsia="Consolas" w:hAnsi="Consolas" w:cs="Consolas"/>
         </w:rPr>
         <w:t>nRows</w:t>
       </w:r>
-      <w:proofErr w:type="spellEnd"/>
       <w:r>
         <w:rPr>
           <w:rFonts w:ascii="Consolas" w:eastAsia="Consolas" w:hAnsi="Consolas" w:cs="Consolas"/>
@@ -1056,7 +970,6 @@
           <w:rFonts w:ascii="Consolas" w:eastAsia="Consolas" w:hAnsi="Consolas" w:cs="Consolas"/>
         </w:rPr>
       </w:pPr>
-      <w:proofErr w:type="spellStart"/>
       <w:r>
         <w:rPr>
           <w:rFonts w:ascii="Consolas" w:eastAsia="Consolas" w:hAnsi="Consolas" w:cs="Consolas"/>
@@ -1064,7 +977,6 @@
         <w:lastRenderedPageBreak/>
         <w:t>nRep</w:t>
       </w:r>
-      <w:proofErr w:type="spellEnd"/>
       <w:r>
         <w:rPr>
           <w:rFonts w:ascii="Consolas" w:eastAsia="Consolas" w:hAnsi="Consolas" w:cs="Consolas"/>
@@ -1104,15 +1016,7 @@
     </w:p>
     <w:p>
       <w:r>
-        <w:t xml:space="preserve">During the seeding of fibers into the RVE, the RVE can be broken up into squares/cells.  Then the fibers are evenly allocated to each square and placed randomly within the square.  Breaking up the space into squares can affect the cluster </w:t>
-      </w:r>
-      <w:proofErr w:type="gramStart"/>
-      <w:r>
-        <w:t>size, but</w:t>
-      </w:r>
-      <w:proofErr w:type="gramEnd"/>
-      <w:r>
-        <w:t xml:space="preserve"> can also do a great deal to speed up relaxation, since fibers can be artificially spread out.  </w:t>
+        <w:t xml:space="preserve">During the seeding of fibers into the RVE, the RVE can be broken up into squares/cells.  Then the fibers are evenly allocated to each square and placed randomly within the square.  Breaking up the space into squares can affect the cluster size, but can also do a great deal to speed up relaxation, since fibers can be artificially spread out.  </w:t>
       </w:r>
     </w:p>
     <w:p>
@@ -1125,104 +1029,22 @@
     </w:p>
     <w:p>
       <w:r>
-        <w:t xml:space="preserve">This is in </w:t>
-      </w:r>
-      <w:proofErr w:type="gramStart"/>
-      <w:r>
-        <w:t>units of number</w:t>
-      </w:r>
-      <w:proofErr w:type="gramEnd"/>
-      <w:r>
-        <w:t xml:space="preserve"> of fibers.  </w:t>
-      </w:r>
-      <w:proofErr w:type="gramStart"/>
-      <w:r>
-        <w:t>Similar to</w:t>
-      </w:r>
-      <w:proofErr w:type="gramEnd"/>
-      <w:r>
-        <w:t xml:space="preserve"> the </w:t>
-      </w:r>
-      <w:proofErr w:type="spellStart"/>
-      <w:r>
-        <w:t>nRows</w:t>
-      </w:r>
-      <w:proofErr w:type="spellEnd"/>
-      <w:r>
-        <w:t xml:space="preserve">, the </w:t>
-      </w:r>
-      <w:proofErr w:type="spellStart"/>
-      <w:r>
+        <w:t>This is in units of number of fibers.  Similar to the nRows, the FPerSquare is actually the square root of the number of fibers that would be in each cell.  So if I had nRows=10 (100 fibers total) and set FPerSquare=5, there would be 4 squares (cells) with 25 fibers in each cell.  If FPerSquare is bigger than the nRows, there will just be one cell/square.  One fiber per cell/square is the default.</w:t>
+      </w:r>
+    </w:p>
+    <w:p>
+      <w:pPr>
+        <w:spacing w:after="0"/>
+        <w:rPr>
+          <w:rFonts w:ascii="Consolas" w:eastAsia="Consolas" w:hAnsi="Consolas" w:cs="Consolas"/>
+        </w:rPr>
+      </w:pPr>
+      <w:r>
+        <w:rPr>
+          <w:rFonts w:ascii="Consolas" w:eastAsia="Consolas" w:hAnsi="Consolas" w:cs="Consolas"/>
+        </w:rPr>
         <w:t>FPerSquare</w:t>
       </w:r>
-      <w:proofErr w:type="spellEnd"/>
-      <w:r>
-        <w:t xml:space="preserve"> is </w:t>
-      </w:r>
-      <w:proofErr w:type="gramStart"/>
-      <w:r>
-        <w:t>actually the</w:t>
-      </w:r>
-      <w:proofErr w:type="gramEnd"/>
-      <w:r>
-        <w:t xml:space="preserve"> square root of the number of fibers that would be in each cell.  </w:t>
-      </w:r>
-      <w:proofErr w:type="gramStart"/>
-      <w:r>
-        <w:t>So</w:t>
-      </w:r>
-      <w:proofErr w:type="gramEnd"/>
-      <w:r>
-        <w:t xml:space="preserve"> if I had </w:t>
-      </w:r>
-      <w:proofErr w:type="spellStart"/>
-      <w:r>
-        <w:t>nRows</w:t>
-      </w:r>
-      <w:proofErr w:type="spellEnd"/>
-      <w:r>
-        <w:t xml:space="preserve">=10 (100 fibers total) and set </w:t>
-      </w:r>
-      <w:proofErr w:type="spellStart"/>
-      <w:r>
-        <w:t>FPerSquare</w:t>
-      </w:r>
-      <w:proofErr w:type="spellEnd"/>
-      <w:r>
-        <w:t xml:space="preserve">=5, there would be 4 squares (cells) with 25 fibers in each cell.  If </w:t>
-      </w:r>
-      <w:proofErr w:type="spellStart"/>
-      <w:r>
-        <w:t>FPerSquare</w:t>
-      </w:r>
-      <w:proofErr w:type="spellEnd"/>
-      <w:r>
-        <w:t xml:space="preserve"> is bigger than the </w:t>
-      </w:r>
-      <w:proofErr w:type="spellStart"/>
-      <w:r>
-        <w:t>nRows</w:t>
-      </w:r>
-      <w:proofErr w:type="spellEnd"/>
-      <w:r>
-        <w:t>, there will just be one cell/square.  One fiber per cell/square is the default.</w:t>
-      </w:r>
-    </w:p>
-    <w:p>
-      <w:pPr>
-        <w:spacing w:after="0"/>
-        <w:rPr>
-          <w:rFonts w:ascii="Consolas" w:eastAsia="Consolas" w:hAnsi="Consolas" w:cs="Consolas"/>
-        </w:rPr>
-      </w:pPr>
-      <w:proofErr w:type="spellStart"/>
-      <w:r>
-        <w:rPr>
-          <w:rFonts w:ascii="Consolas" w:eastAsia="Consolas" w:hAnsi="Consolas" w:cs="Consolas"/>
-        </w:rPr>
-        <w:t>FPerSquare</w:t>
-      </w:r>
-      <w:proofErr w:type="spellEnd"/>
       <w:r>
         <w:rPr>
           <w:rFonts w:ascii="Consolas" w:eastAsia="Consolas" w:hAnsi="Consolas" w:cs="Consolas"/>
@@ -1286,17 +1108,7 @@
     </w:p>
     <w:p>
       <w:r>
-        <w:t>This is unitless, and the actual margin is margin*</w:t>
-      </w:r>
-      <w:proofErr w:type="spellStart"/>
-      <w:proofErr w:type="gramStart"/>
-      <w:r>
-        <w:t>fiberRadius</w:t>
-      </w:r>
-      <w:proofErr w:type="spellEnd"/>
-      <w:proofErr w:type="gramEnd"/>
-      <w:r>
-        <w:t>.  When there are multiple radii, it is the maximum radius.  When the margin is 1, then fibers from adjacent cells will not be touching each other during seeding.  The margin can help to add kinetic energy to the system by crowding the fibers to the center of the square, so that they all push out of the center at high speeds.  0.75 is the default.</w:t>
+        <w:t>This is unitless, and the actual margin is margin*fiberRadius.  When there are multiple radii, it is the maximum radius.  When the margin is 1, then fibers from adjacent cells will not be touching each other during seeding.  The margin can help to add kinetic energy to the system by crowding the fibers to the center of the square, so that they all push out of the center at high speeds.  0.75 is the default.</w:t>
       </w:r>
     </w:p>
     <w:p>
@@ -1386,14 +1198,12 @@
           <w:rFonts w:ascii="Consolas" w:eastAsia="Consolas" w:hAnsi="Consolas" w:cs="Consolas"/>
         </w:rPr>
       </w:pPr>
-      <w:proofErr w:type="spellStart"/>
       <w:r>
         <w:rPr>
           <w:rFonts w:ascii="Consolas" w:eastAsia="Consolas" w:hAnsi="Consolas" w:cs="Consolas"/>
         </w:rPr>
         <w:t>MultipleRadii</w:t>
       </w:r>
-      <w:proofErr w:type="spellEnd"/>
       <w:r>
         <w:rPr>
           <w:rFonts w:ascii="Consolas" w:eastAsia="Consolas" w:hAnsi="Consolas" w:cs="Consolas"/>
@@ -1419,15 +1229,7 @@
         <w:t xml:space="preserve"> the radius of the fiber is based on where it falls within the percentages.  For the example above, 0.0-0.4 would have r=1, 0.4-0.7 would have r=2, 0.7-0.85 would have r=4, and 0.85-1.0 would have r=6.  Because this is a random process, the volume fraction </w:t>
       </w:r>
       <w:r>
-        <w:t xml:space="preserve">ends up being slightly off, and the boundary is adjusted to fit it exactly.  This may cause a few </w:t>
-      </w:r>
-      <w:proofErr w:type="gramStart"/>
-      <w:r>
-        <w:t>edge</w:t>
-      </w:r>
-      <w:proofErr w:type="gramEnd"/>
-      <w:r>
-        <w:t xml:space="preserve"> fibers to be slightly past the edge, so care should be taken,</w:t>
+        <w:t>ends up being slightly off, and the boundary is adjusted to fit it exactly.  This may cause a few edge fibers to be slightly past the edge, so care should be taken,</w:t>
       </w:r>
       <w:r>
         <w:t xml:space="preserve"> especially for smaller RVEs.  The more fibers in the RVE, the </w:t>
@@ -1467,14 +1269,12 @@
           <w:rFonts w:ascii="Consolas" w:eastAsia="Consolas" w:hAnsi="Consolas" w:cs="Consolas"/>
         </w:rPr>
       </w:pPr>
-      <w:proofErr w:type="spellStart"/>
       <w:r>
         <w:rPr>
           <w:rFonts w:ascii="Consolas" w:eastAsia="Consolas" w:hAnsi="Consolas" w:cs="Consolas"/>
         </w:rPr>
         <w:t>MinSpacing</w:t>
       </w:r>
-      <w:proofErr w:type="spellEnd"/>
       <w:r>
         <w:rPr>
           <w:rFonts w:ascii="Consolas" w:eastAsia="Consolas" w:hAnsi="Consolas" w:cs="Consolas"/>
@@ -1544,14 +1344,12 @@
       </w:r>
     </w:p>
     <w:p>
-      <w:proofErr w:type="spellStart"/>
       <w:r>
         <w:rPr>
           <w:rFonts w:ascii="Consolas" w:eastAsia="Consolas" w:hAnsi="Consolas" w:cs="Consolas"/>
         </w:rPr>
         <w:t>ConDamp</w:t>
       </w:r>
-      <w:proofErr w:type="spellEnd"/>
       <w:r>
         <w:rPr>
           <w:rFonts w:ascii="Consolas" w:eastAsia="Consolas" w:hAnsi="Consolas" w:cs="Consolas"/>
@@ -1570,31 +1368,21 @@
     </w:p>
     <w:p>
       <w:r>
-        <w:t xml:space="preserve">This is the damping coefficient for the movement of an individual fiber.  This slows down the speed of </w:t>
-      </w:r>
-      <w:proofErr w:type="gramStart"/>
-      <w:r>
-        <w:t>a fiber</w:t>
-      </w:r>
-      <w:proofErr w:type="gramEnd"/>
-      <w:r>
-        <w:t>.  A value of 1 is critical damping, while &gt;1 is overdamped and &lt;1 is underdamped.  Some global damping is almost always needed to keep the simulation from blowing up.  I’ve found that values above 2.0 are in danger of becoming unstable.  Global damping should be used with contact damping to help speed up the fiber settling.  The default value is 1.0.</w:t>
-      </w:r>
-    </w:p>
-    <w:p>
-      <w:pPr>
-        <w:rPr>
-          <w:rFonts w:ascii="Consolas" w:eastAsia="Consolas" w:hAnsi="Consolas" w:cs="Consolas"/>
-        </w:rPr>
-      </w:pPr>
-      <w:proofErr w:type="spellStart"/>
+        <w:t>This is the damping coefficient for the movement of an individual fiber.  This slows down the speed of a fiber.  A value of 1 is critical damping, while &gt;1 is overdamped and &lt;1 is underdamped.  Some global damping is almost always needed to keep the simulation from blowing up.  I’ve found that values above 2.0 are in danger of becoming unstable.  Global damping should be used with contact damping to help speed up the fiber settling.  The default value is 1.0.</w:t>
+      </w:r>
+    </w:p>
+    <w:p>
+      <w:pPr>
+        <w:rPr>
+          <w:rFonts w:ascii="Consolas" w:eastAsia="Consolas" w:hAnsi="Consolas" w:cs="Consolas"/>
+        </w:rPr>
+      </w:pPr>
       <w:r>
         <w:rPr>
           <w:rFonts w:ascii="Consolas" w:eastAsia="Consolas" w:hAnsi="Consolas" w:cs="Consolas"/>
         </w:rPr>
         <w:t>GlobDamp</w:t>
       </w:r>
-      <w:proofErr w:type="spellEnd"/>
       <w:r>
         <w:rPr>
           <w:rFonts w:ascii="Consolas" w:eastAsia="Consolas" w:hAnsi="Consolas" w:cs="Consolas"/>
@@ -1613,51 +1401,33 @@
     </w:p>
     <w:p>
       <w:r>
-        <w:t xml:space="preserve">This is Global Damping that increases with increasing time steps.  This helps to keep the system from moving around indefinitely and settles the fibers. The global damping coefficient is calculated as 1.0 / </w:t>
-      </w:r>
-      <w:proofErr w:type="spellStart"/>
-      <w:r>
+        <w:t xml:space="preserve">This is Global Damping that increases with increasing time steps.  This helps to keep the system from moving around indefinitely and settles the fibers. The global damping coefficient is calculated as 1.0 / IncrDamp * (i - nStepsWithoutDamping), where i is the number of time steps.  </w:t>
+      </w:r>
+      <w:r>
+        <w:t xml:space="preserve">This planes out when the global damping is reached.  </w:t>
+      </w:r>
+      <w:r>
+        <w:t>The default value is 0.0</w:t>
+      </w:r>
+      <w:r>
+        <w:t>0</w:t>
+      </w:r>
+      <w:r>
+        <w:t>1.</w:t>
+      </w:r>
+    </w:p>
+    <w:p>
+      <w:pPr>
+        <w:rPr>
+          <w:rFonts w:ascii="Consolas" w:eastAsia="Consolas" w:hAnsi="Consolas" w:cs="Consolas"/>
+        </w:rPr>
+      </w:pPr>
+      <w:r>
+        <w:rPr>
+          <w:rFonts w:ascii="Consolas" w:eastAsia="Consolas" w:hAnsi="Consolas" w:cs="Consolas"/>
+        </w:rPr>
         <w:t>IncrDamp</w:t>
       </w:r>
-      <w:proofErr w:type="spellEnd"/>
-      <w:r>
-        <w:t xml:space="preserve"> * (i - </w:t>
-      </w:r>
-      <w:proofErr w:type="spellStart"/>
-      <w:r>
-        <w:t>nStepsWithoutDamping</w:t>
-      </w:r>
-      <w:proofErr w:type="spellEnd"/>
-      <w:r>
-        <w:t xml:space="preserve">), where i is the number of time steps.  </w:t>
-      </w:r>
-      <w:r>
-        <w:t xml:space="preserve">This planes out when the global damping is reached.  </w:t>
-      </w:r>
-      <w:r>
-        <w:t>The default value is 0.0</w:t>
-      </w:r>
-      <w:r>
-        <w:t>0</w:t>
-      </w:r>
-      <w:r>
-        <w:t>1.</w:t>
-      </w:r>
-    </w:p>
-    <w:p>
-      <w:pPr>
-        <w:rPr>
-          <w:rFonts w:ascii="Consolas" w:eastAsia="Consolas" w:hAnsi="Consolas" w:cs="Consolas"/>
-        </w:rPr>
-      </w:pPr>
-      <w:proofErr w:type="spellStart"/>
-      <w:r>
-        <w:rPr>
-          <w:rFonts w:ascii="Consolas" w:eastAsia="Consolas" w:hAnsi="Consolas" w:cs="Consolas"/>
-        </w:rPr>
-        <w:t>IncrDamp</w:t>
-      </w:r>
-      <w:proofErr w:type="spellEnd"/>
       <w:r>
         <w:rPr>
           <w:rFonts w:ascii="Consolas" w:eastAsia="Consolas" w:hAnsi="Consolas" w:cs="Consolas"/>
@@ -1683,55 +1453,21 @@
     </w:p>
     <w:p>
       <w:r>
-        <w:t xml:space="preserve">This </w:t>
-      </w:r>
-      <w:proofErr w:type="gramStart"/>
-      <w:r>
-        <w:t>control</w:t>
-      </w:r>
-      <w:proofErr w:type="gramEnd"/>
-      <w:r>
-        <w:t xml:space="preserve"> the maximum number of time steps that are allowed during relaxation.  To make sure that the simulation settles and there are very few overlaps, this should be set to something very high, then you can look at the </w:t>
-      </w:r>
-      <w:proofErr w:type="spellStart"/>
-      <w:r>
-        <w:t>Pack_All</w:t>
-      </w:r>
-      <w:proofErr w:type="spellEnd"/>
-      <w:r>
-        <w:t xml:space="preserve"> file to see how many iterations were </w:t>
-      </w:r>
-      <w:proofErr w:type="gramStart"/>
-      <w:r>
-        <w:t>actually used</w:t>
-      </w:r>
-      <w:proofErr w:type="gramEnd"/>
-      <w:r>
-        <w:t xml:space="preserve"> for convergence.  I usually set this to 8000 when running final </w:t>
-      </w:r>
-      <w:proofErr w:type="gramStart"/>
-      <w:r>
-        <w:t>runs, but</w:t>
-      </w:r>
-      <w:proofErr w:type="gramEnd"/>
-      <w:r>
-        <w:t xml:space="preserve"> set it low (1000) when I am experimenting or trying out a new input file.  The default value is 3000.</w:t>
-      </w:r>
-    </w:p>
-    <w:p>
-      <w:pPr>
-        <w:rPr>
-          <w:rFonts w:ascii="Consolas" w:eastAsia="Consolas" w:hAnsi="Consolas" w:cs="Consolas"/>
-        </w:rPr>
-      </w:pPr>
-      <w:proofErr w:type="spellStart"/>
+        <w:t>This control the maximum number of time steps that are allowed during relaxation.  To make sure that the simulation settles and there are very few overlaps, this should be set to something very high, then you can look at the Pack_All file to see how many iterations were actually used for convergence.  I usually set this to 8000 when running final runs, but set it low (1000) when I am experimenting or trying out a new input file.  The default value is 3000.</w:t>
+      </w:r>
+    </w:p>
+    <w:p>
+      <w:pPr>
+        <w:rPr>
+          <w:rFonts w:ascii="Consolas" w:eastAsia="Consolas" w:hAnsi="Consolas" w:cs="Consolas"/>
+        </w:rPr>
+      </w:pPr>
       <w:r>
         <w:rPr>
           <w:rFonts w:ascii="Consolas" w:eastAsia="Consolas" w:hAnsi="Consolas" w:cs="Consolas"/>
         </w:rPr>
         <w:t>MaxSteps</w:t>
       </w:r>
-      <w:proofErr w:type="spellEnd"/>
       <w:r>
         <w:rPr>
           <w:rFonts w:ascii="Consolas" w:eastAsia="Consolas" w:hAnsi="Consolas" w:cs="Consolas"/>
@@ -1765,14 +1501,12 @@
           <w:rFonts w:ascii="Consolas" w:eastAsia="Consolas" w:hAnsi="Consolas" w:cs="Consolas"/>
         </w:rPr>
       </w:pPr>
-      <w:proofErr w:type="spellStart"/>
       <w:r>
         <w:rPr>
           <w:rFonts w:ascii="Consolas" w:eastAsia="Consolas" w:hAnsi="Consolas" w:cs="Consolas"/>
         </w:rPr>
         <w:t>UndampedSteps</w:t>
       </w:r>
-      <w:proofErr w:type="spellEnd"/>
       <w:r>
         <w:rPr>
           <w:rFonts w:ascii="Consolas" w:eastAsia="Consolas" w:hAnsi="Consolas" w:cs="Consolas"/>
@@ -1806,14 +1540,12 @@
           <w:rFonts w:ascii="Consolas" w:eastAsia="Consolas" w:hAnsi="Consolas" w:cs="Consolas"/>
         </w:rPr>
       </w:pPr>
-      <w:proofErr w:type="spellStart"/>
       <w:r>
         <w:rPr>
           <w:rFonts w:ascii="Consolas" w:eastAsia="Consolas" w:hAnsi="Consolas" w:cs="Consolas"/>
         </w:rPr>
         <w:t>perKECutoff</w:t>
       </w:r>
-      <w:proofErr w:type="spellEnd"/>
       <w:r>
         <w:rPr>
           <w:rFonts w:ascii="Consolas" w:eastAsia="Consolas" w:hAnsi="Consolas" w:cs="Consolas"/>
@@ -1838,52 +1570,21 @@
     </w:p>
     <w:p>
       <w:r>
-        <w:t xml:space="preserve">This makes </w:t>
-      </w:r>
-      <w:proofErr w:type="spellStart"/>
-      <w:r>
-        <w:t>nRows</w:t>
-      </w:r>
-      <w:proofErr w:type="spellEnd"/>
-      <w:r>
-        <w:t xml:space="preserve"> </w:t>
-      </w:r>
-      <w:proofErr w:type="gramStart"/>
-      <w:r>
-        <w:t>actually the</w:t>
-      </w:r>
-      <w:proofErr w:type="gramEnd"/>
-      <w:r>
-        <w:t xml:space="preserve"> number of fibers rather than the square root of the number of fibers.  If this is true </w:t>
-      </w:r>
-      <w:proofErr w:type="gramStart"/>
-      <w:r>
-        <w:t xml:space="preserve">and </w:t>
-      </w:r>
-      <w:proofErr w:type="spellStart"/>
-      <w:r>
-        <w:t>nRows</w:t>
-      </w:r>
-      <w:proofErr w:type="spellEnd"/>
-      <w:proofErr w:type="gramEnd"/>
-      <w:r>
-        <w:t xml:space="preserve"> is set to 50, then there will be 50 fibers.  The default value is False.</w:t>
-      </w:r>
-    </w:p>
-    <w:p>
-      <w:pPr>
-        <w:rPr>
-          <w:rFonts w:ascii="Consolas" w:eastAsia="Consolas" w:hAnsi="Consolas" w:cs="Consolas"/>
-        </w:rPr>
-      </w:pPr>
-      <w:proofErr w:type="spellStart"/>
+        <w:t>This makes nRows actually the number of fibers rather than the square root of the number of fibers.  If this is true and nRows is set to 50, then there will be 50 fibers.  The default value is False.</w:t>
+      </w:r>
+    </w:p>
+    <w:p>
+      <w:pPr>
+        <w:rPr>
+          <w:rFonts w:ascii="Consolas" w:eastAsia="Consolas" w:hAnsi="Consolas" w:cs="Consolas"/>
+        </w:rPr>
+      </w:pPr>
       <w:r>
         <w:rPr>
           <w:rFonts w:ascii="Consolas" w:eastAsia="Consolas" w:hAnsi="Consolas" w:cs="Consolas"/>
         </w:rPr>
         <w:t>IsNRowsActuallyNFibers</w:t>
       </w:r>
-      <w:proofErr w:type="spellEnd"/>
       <w:r>
         <w:rPr>
           <w:rFonts w:ascii="Consolas" w:eastAsia="Consolas" w:hAnsi="Consolas" w:cs="Consolas"/>
@@ -1917,14 +1618,12 @@
           <w:rFonts w:ascii="Consolas" w:eastAsia="Consolas" w:hAnsi="Consolas" w:cs="Consolas"/>
         </w:rPr>
       </w:pPr>
-      <w:proofErr w:type="spellStart"/>
       <w:r>
         <w:rPr>
           <w:rFonts w:ascii="Consolas" w:eastAsia="Consolas" w:hAnsi="Consolas" w:cs="Consolas"/>
         </w:rPr>
         <w:t>RVEHoverW</w:t>
       </w:r>
-      <w:proofErr w:type="spellEnd"/>
       <w:r>
         <w:rPr>
           <w:rFonts w:ascii="Consolas" w:eastAsia="Consolas" w:hAnsi="Consolas" w:cs="Consolas"/>
@@ -1975,14 +1674,12 @@
           <w:rFonts w:ascii="Consolas" w:eastAsia="Consolas" w:hAnsi="Consolas" w:cs="Consolas"/>
         </w:rPr>
       </w:pPr>
-      <w:proofErr w:type="spellStart"/>
       <w:r>
         <w:rPr>
           <w:rFonts w:ascii="Consolas" w:eastAsia="Consolas" w:hAnsi="Consolas" w:cs="Consolas"/>
         </w:rPr>
         <w:t>RVEThickness</w:t>
       </w:r>
-      <w:proofErr w:type="spellEnd"/>
       <w:r>
         <w:rPr>
           <w:rFonts w:ascii="Consolas" w:eastAsia="Consolas" w:hAnsi="Consolas" w:cs="Consolas"/>
@@ -2012,47 +1709,10 @@
     </w:p>
     <w:p>
       <w:r>
-        <w:t xml:space="preserve">If this option is set to true, it will check for overlaps (contacts) at the end of the </w:t>
-      </w:r>
-      <w:proofErr w:type="gramStart"/>
-      <w:r>
-        <w:t>relaxation, and</w:t>
-      </w:r>
-      <w:proofErr w:type="gramEnd"/>
-      <w:r>
-        <w:t xml:space="preserve"> stop the fibers and re-run the analysis from the current position if there are overlaps.  </w:t>
-      </w:r>
-      <w:r>
-        <w:t xml:space="preserve">If you have </w:t>
-      </w:r>
-      <w:proofErr w:type="gramStart"/>
-      <w:r>
-        <w:t xml:space="preserve">a </w:t>
-      </w:r>
-      <w:proofErr w:type="spellStart"/>
-      <w:r>
-        <w:t>minSpacing</w:t>
-      </w:r>
-      <w:proofErr w:type="spellEnd"/>
-      <w:proofErr w:type="gramEnd"/>
-      <w:r>
-        <w:t xml:space="preserve">, </w:t>
-      </w:r>
-      <w:proofErr w:type="gramStart"/>
-      <w:r>
-        <w:t>this</w:t>
-      </w:r>
-      <w:proofErr w:type="gramEnd"/>
-      <w:r>
-        <w:t xml:space="preserve"> just flags </w:t>
-      </w:r>
-      <w:proofErr w:type="gramStart"/>
-      <w:r>
-        <w:t>overlaps</w:t>
-      </w:r>
-      <w:proofErr w:type="gramEnd"/>
-      <w:r>
-        <w:t xml:space="preserve"> after the radius has been re-adjusted to the original radius.  </w:t>
+        <w:t xml:space="preserve">If this option is set to true, it will check for overlaps (contacts) at the end of the relaxation, and stop the fibers and re-run the analysis from the current position if there are overlaps.  </w:t>
+      </w:r>
+      <w:r>
+        <w:t xml:space="preserve">If you have a minSpacing, this just flags overlaps after the radius has been re-adjusted to the original radius.  </w:t>
       </w:r>
       <w:r>
         <w:t>If there are still overlaps after re-running, an exception will be thrown.  This is by default set to false, since many methods allow a slight overlap.</w:t>
@@ -2064,14 +1724,12 @@
           <w:rFonts w:ascii="Consolas" w:eastAsia="Consolas" w:hAnsi="Consolas" w:cs="Consolas"/>
         </w:rPr>
       </w:pPr>
-      <w:proofErr w:type="spellStart"/>
       <w:r>
         <w:rPr>
           <w:rFonts w:ascii="Consolas" w:eastAsia="Consolas" w:hAnsi="Consolas" w:cs="Consolas"/>
         </w:rPr>
         <w:t>DoNotAllowOverlaps</w:t>
       </w:r>
-      <w:proofErr w:type="spellEnd"/>
       <w:r>
         <w:rPr>
           <w:rFonts w:ascii="Consolas" w:eastAsia="Consolas" w:hAnsi="Consolas" w:cs="Consolas"/>
@@ -2090,23 +1748,7 @@
     </w:p>
     <w:p>
       <w:r>
-        <w:t xml:space="preserve">Boundary types </w:t>
-      </w:r>
-      <w:proofErr w:type="gramStart"/>
-      <w:r>
-        <w:t>indicates</w:t>
-      </w:r>
-      <w:proofErr w:type="gramEnd"/>
-      <w:r>
-        <w:t xml:space="preserve"> what they y and z boundaries are.  The x-boundary is always linear displacements.  The y and z boundaries are periodic by default (p</w:t>
-      </w:r>
-      <w:proofErr w:type="gramStart"/>
-      <w:r>
-        <w:t>), but</w:t>
-      </w:r>
-      <w:proofErr w:type="gramEnd"/>
-      <w:r>
-        <w:t xml:space="preserve"> can be set to solid walls (s).  Separated by a “/”</w:t>
+        <w:t>Boundary types indicates what they y and z boundaries are.  The x-boundary is always linear displacements.  The y and z boundaries are periodic by default (p), but can be set to solid walls (s).  Separated by a “/”</w:t>
       </w:r>
     </w:p>
     <w:p>
@@ -2154,14 +1796,12 @@
           <w:rFonts w:ascii="Consolas" w:eastAsia="Consolas" w:hAnsi="Consolas" w:cs="Consolas"/>
         </w:rPr>
       </w:pPr>
-      <w:proofErr w:type="spellStart"/>
       <w:r>
         <w:rPr>
           <w:rFonts w:ascii="Consolas" w:eastAsia="Consolas" w:hAnsi="Consolas" w:cs="Consolas"/>
         </w:rPr>
         <w:t>MinBoundarySpacing</w:t>
       </w:r>
-      <w:proofErr w:type="spellEnd"/>
       <w:r>
         <w:rPr>
           <w:rFonts w:ascii="Consolas" w:eastAsia="Consolas" w:hAnsi="Consolas" w:cs="Consolas"/>
@@ -2195,55 +1835,21 @@
     </w:p>
     <w:p>
       <w:r>
-        <w:t xml:space="preserve">This saves a .csv file named “nameOfInputFile_Pack_#Rep_All.csv”.  This file saves </w:t>
-      </w:r>
-      <w:proofErr w:type="gramStart"/>
-      <w:r>
-        <w:t>the fiber</w:t>
-      </w:r>
-      <w:proofErr w:type="gramEnd"/>
-      <w:r>
-        <w:t xml:space="preserve"> positions, contacts, homogenized stress/strain, and boundaries at every X time </w:t>
-      </w:r>
-      <w:proofErr w:type="gramStart"/>
-      <w:r>
-        <w:t>steps</w:t>
-      </w:r>
-      <w:proofErr w:type="gramEnd"/>
-      <w:r>
-        <w:t xml:space="preserve"> (X = </w:t>
-      </w:r>
-      <w:proofErr w:type="spellStart"/>
-      <w:r>
-        <w:t>nMaxSteps</w:t>
-      </w:r>
-      <w:proofErr w:type="spellEnd"/>
-      <w:r>
-        <w:t xml:space="preserve">/100).  This can be used with PlotFDEM.exe, either in the “Fiber Only” or “Contact Force Plot” to watch the relaxation simulation.  These are nice to have a good idea of the generation and </w:t>
-      </w:r>
-      <w:proofErr w:type="gramStart"/>
-      <w:r>
-        <w:t>seeding, but</w:t>
-      </w:r>
-      <w:proofErr w:type="gramEnd"/>
-      <w:r>
-        <w:t xml:space="preserve"> can often be large files.  The fibers will be bigger than the final size if the minimum fiber spacing is non-zero.  This file can be used in FDEM to load the packing rather than re-doing the packing.  Default is False.</w:t>
-      </w:r>
-    </w:p>
-    <w:p>
-      <w:pPr>
-        <w:rPr>
-          <w:rFonts w:ascii="Consolas" w:eastAsia="Consolas" w:hAnsi="Consolas" w:cs="Consolas"/>
-        </w:rPr>
-      </w:pPr>
-      <w:proofErr w:type="spellStart"/>
+        <w:t>This saves a .csv file named “nameOfInputFile_Pack_#Rep_All.csv”.  This file saves the fiber positions, contacts, homogenized stress/strain, and boundaries at every X time steps (X = nMaxSteps/100).  This can be used with PlotFDEM.exe, either in the “Fiber Only” or “Contact Force Plot” to watch the relaxation simulation.  These are nice to have a good idea of the generation and seeding, but can often be large files.  The fibers will be bigger than the final size if the minimum fiber spacing is non-zero.  This file can be used in FDEM to load the packing rather than re-doing the packing.  Default is False.</w:t>
+      </w:r>
+    </w:p>
+    <w:p>
+      <w:pPr>
+        <w:rPr>
+          <w:rFonts w:ascii="Consolas" w:eastAsia="Consolas" w:hAnsi="Consolas" w:cs="Consolas"/>
+        </w:rPr>
+      </w:pPr>
       <w:r>
         <w:rPr>
           <w:rFonts w:ascii="Consolas" w:eastAsia="Consolas" w:hAnsi="Consolas" w:cs="Consolas"/>
         </w:rPr>
         <w:t>SaveResults</w:t>
       </w:r>
-      <w:proofErr w:type="spellEnd"/>
       <w:r>
         <w:rPr>
           <w:rFonts w:ascii="Consolas" w:eastAsia="Consolas" w:hAnsi="Consolas" w:cs="Consolas"/>
@@ -2263,34 +1869,16 @@
     <w:p>
       <w:r>
         <w:lastRenderedPageBreak/>
-        <w:t xml:space="preserve">This saves a .csv file named “nameOfInputFile_Pack_#Rep.csv”.  This file saves the fiber positions and radius at </w:t>
-      </w:r>
-      <w:proofErr w:type="gramStart"/>
-      <w:r>
-        <w:t>the  end</w:t>
-      </w:r>
-      <w:proofErr w:type="gramEnd"/>
-      <w:r>
-        <w:t xml:space="preserve"> of the relaxation simulation.  This is the </w:t>
-      </w:r>
-      <w:proofErr w:type="gramStart"/>
-      <w:r>
-        <w:t>best for using</w:t>
-      </w:r>
-      <w:proofErr w:type="gramEnd"/>
-      <w:r>
-        <w:t xml:space="preserve"> the results elsewhere.  Default is False.</w:t>
-      </w:r>
-    </w:p>
-    <w:p>
-      <w:proofErr w:type="spellStart"/>
+        <w:t>This saves a .csv file named “nameOfInputFile_Pack_#Rep.csv”.  This file saves the fiber positions and radius at the  end of the relaxation simulation.  This is the best for using the results elsewhere.  Default is False.</w:t>
+      </w:r>
+    </w:p>
+    <w:p>
       <w:r>
         <w:rPr>
           <w:rFonts w:ascii="Consolas" w:eastAsia="Consolas" w:hAnsi="Consolas" w:cs="Consolas"/>
         </w:rPr>
         <w:t>SaveFinalPositions</w:t>
       </w:r>
-      <w:proofErr w:type="spellEnd"/>
       <w:r>
         <w:rPr>
           <w:rFonts w:ascii="Consolas" w:eastAsia="Consolas" w:hAnsi="Consolas" w:cs="Consolas"/>
@@ -2309,23 +1897,7 @@
     </w:p>
     <w:p>
       <w:r>
-        <w:t xml:space="preserve">This saves a .csv file named “nameOfInputFile_Pack_#Rep.csv”.  This file saves the fiber positions and radius at </w:t>
-      </w:r>
-      <w:proofErr w:type="gramStart"/>
-      <w:r>
-        <w:t>the  end</w:t>
-      </w:r>
-      <w:proofErr w:type="gramEnd"/>
-      <w:r>
-        <w:t xml:space="preserve"> of the relaxation </w:t>
-      </w:r>
-      <w:proofErr w:type="gramStart"/>
-      <w:r>
-        <w:t>simulation, but</w:t>
-      </w:r>
-      <w:proofErr w:type="gramEnd"/>
-      <w:r>
-        <w:t xml:space="preserve"> does not include the projected fibers.  The projected fibers are what give the RVE their periodicity. I don’t remember what case I needed this for</w:t>
+        <w:t>This saves a .csv file named “nameOfInputFile_Pack_#Rep.csv”.  This file saves the fiber positions and radius at the  end of the relaxation simulation, but does not include the projected fibers.  The projected fibers are what give the RVE their periodicity. I don’t remember what case I needed this for</w:t>
       </w:r>
       <w:r>
         <w:rPr>
@@ -2343,14 +1915,12 @@
           <w:rFonts w:ascii="Consolas" w:eastAsia="Consolas" w:hAnsi="Consolas" w:cs="Consolas"/>
         </w:rPr>
       </w:pPr>
-      <w:proofErr w:type="spellStart"/>
       <w:r>
         <w:rPr>
           <w:rFonts w:ascii="Consolas" w:eastAsia="Consolas" w:hAnsi="Consolas" w:cs="Consolas"/>
         </w:rPr>
         <w:t>SaveFinalPositionsWithoutProjections</w:t>
       </w:r>
-      <w:proofErr w:type="spellEnd"/>
       <w:r>
         <w:rPr>
           <w:rFonts w:ascii="Consolas" w:eastAsia="Consolas" w:hAnsi="Consolas" w:cs="Consolas"/>
@@ -2372,31 +1942,21 @@
     </w:p>
     <w:p>
       <w:r>
-        <w:t xml:space="preserve">This saves the mean, IQR (Inter-quartile region) and kurtosis of the distribution of local fiber volume fractions in an output file.  It goes in the same _Pack file as the </w:t>
-      </w:r>
-      <w:proofErr w:type="gramStart"/>
-      <w:r>
-        <w:t>others, and</w:t>
-      </w:r>
-      <w:proofErr w:type="gramEnd"/>
-      <w:r>
-        <w:t xml:space="preserve"> is placed at the end.  Default is False.</w:t>
-      </w:r>
-    </w:p>
-    <w:p>
-      <w:pPr>
-        <w:rPr>
-          <w:rFonts w:ascii="Consolas" w:eastAsia="Consolas" w:hAnsi="Consolas" w:cs="Consolas"/>
-        </w:rPr>
-      </w:pPr>
-      <w:proofErr w:type="spellStart"/>
+        <w:t>This saves the mean, IQR (Inter-quartile region) and kurtosis of the distribution of local fiber volume fractions in an output file.  It goes in the same _Pack file as the others, and is placed at the end.  Default is False.</w:t>
+      </w:r>
+    </w:p>
+    <w:p>
+      <w:pPr>
+        <w:rPr>
+          <w:rFonts w:ascii="Consolas" w:eastAsia="Consolas" w:hAnsi="Consolas" w:cs="Consolas"/>
+        </w:rPr>
+      </w:pPr>
       <w:r>
         <w:rPr>
           <w:rFonts w:ascii="Consolas" w:eastAsia="Consolas" w:hAnsi="Consolas" w:cs="Consolas"/>
         </w:rPr>
         <w:t>SaveVfStatistics</w:t>
       </w:r>
-      <w:proofErr w:type="spellEnd"/>
       <w:r>
         <w:rPr>
           <w:rFonts w:ascii="Consolas" w:eastAsia="Consolas" w:hAnsi="Consolas" w:cs="Consolas"/>
@@ -2418,34 +1978,16 @@
     </w:p>
     <w:p>
       <w:r>
-        <w:t xml:space="preserve">This is only active when </w:t>
-      </w:r>
-      <w:proofErr w:type="spellStart"/>
-      <w:r>
-        <w:t>SaveVfStatistics</w:t>
-      </w:r>
-      <w:proofErr w:type="spellEnd"/>
-      <w:r>
-        <w:t xml:space="preserve"> is true, but it outputs a connection plot, which plots the triangulation using </w:t>
-      </w:r>
-      <w:proofErr w:type="spellStart"/>
-      <w:r>
-        <w:t>PlotFDEM</w:t>
-      </w:r>
-      <w:proofErr w:type="spellEnd"/>
-      <w:r>
-        <w:t>.  This is the triangulation used both for the volume fraction data, but also for the identification of fiber pairs when a matrix model is applied.</w:t>
-      </w:r>
-    </w:p>
-    <w:p>
-      <w:proofErr w:type="spellStart"/>
+        <w:t>This is only active when SaveVfStatistics is true, but it outputs a connection plot, which plots the triangulation using PlotFDEM.  This is the triangulation used both for the volume fraction data, but also for the identification of fiber pairs when a matrix model is applied.</w:t>
+      </w:r>
+    </w:p>
+    <w:p>
       <w:r>
         <w:rPr>
           <w:rFonts w:ascii="Consolas" w:eastAsia="Consolas" w:hAnsi="Consolas" w:cs="Consolas"/>
         </w:rPr>
         <w:t>SaveConnectionPlot</w:t>
       </w:r>
-      <w:proofErr w:type="spellEnd"/>
       <w:r>
         <w:rPr>
           <w:rFonts w:ascii="Consolas" w:eastAsia="Consolas" w:hAnsi="Consolas" w:cs="Consolas"/>
@@ -2456,8 +1998,120 @@
     </w:p>
     <w:p>
       <w:pPr>
+        <w:pStyle w:val="Heading2"/>
+      </w:pPr>
+      <w:r>
+        <w:t>Creating a mesh</w:t>
+      </w:r>
+    </w:p>
+    <w:p>
+      <w:pPr>
+        <w:pStyle w:val="Heading4"/>
+      </w:pPr>
+      <w:r>
+        <w:t>FxTMesh</w:t>
+      </w:r>
+    </w:p>
+    <w:p>
+      <w:r>
+        <w:t>This command generates a mesh for FxT, where the mesh is based on triangulation of fiber centers.  It will output a folder for all of the FxT inputs.  The value (2, 3, 4, 5, 22, 23, 24, 25) corresponds to the order of the mesh, where:</w:t>
+      </w:r>
+    </w:p>
+    <w:p>
+      <w:pPr>
+        <w:ind w:firstLine="720"/>
+      </w:pPr>
+      <w:r>
+        <w:t>2 = 6-noded triangles and 8-noded quads</w:t>
+      </w:r>
+    </w:p>
+    <w:p>
+      <w:pPr>
+        <w:ind w:firstLine="720"/>
+      </w:pPr>
+      <w:r>
+        <w:t>3 = 6-noded triangles and 9-noded quads</w:t>
+      </w:r>
+    </w:p>
+    <w:p>
+      <w:pPr>
+        <w:ind w:firstLine="720"/>
+      </w:pPr>
+      <w:r>
+        <w:t>4 = 9-noded triangles and 12-noded quads</w:t>
+      </w:r>
+    </w:p>
+    <w:p>
+      <w:pPr>
+        <w:ind w:firstLine="720"/>
+      </w:pPr>
+      <w:r>
+        <w:t>5 = 9-noded triangles and 16-noded quads</w:t>
+      </w:r>
+    </w:p>
+    <w:p>
+      <w:r>
+        <w:t>All of the 20-series are the same, but have a 2.5 D mesh (where there is one dof for the entire model that corresponds to the out of plane stretching.</w:t>
+      </w:r>
+    </w:p>
+    <w:p>
+      <w:pPr>
+        <w:rPr>
+          <w:rFonts w:ascii="Consolas" w:eastAsia="Consolas" w:hAnsi="Consolas" w:cs="Consolas"/>
+        </w:rPr>
+      </w:pPr>
+      <w:r>
+        <w:rPr>
+          <w:rFonts w:ascii="Consolas" w:eastAsia="Consolas" w:hAnsi="Consolas" w:cs="Consolas"/>
+        </w:rPr>
+        <w:t>FxTMesh</w:t>
+      </w:r>
+      <w:r>
+        <w:rPr>
+          <w:rFonts w:ascii="Consolas" w:eastAsia="Consolas" w:hAnsi="Consolas" w:cs="Consolas"/>
+        </w:rPr>
+        <w:tab/>
+        <w:t>2</w:t>
+      </w:r>
+    </w:p>
+    <w:p>
+      <w:pPr>
+        <w:pStyle w:val="Heading4"/>
+      </w:pPr>
+      <w:r>
+        <w:lastRenderedPageBreak/>
+        <w:t>CrossPly</w:t>
+      </w:r>
+    </w:p>
+    <w:p>
+      <w:r>
+        <w:t>This must be used with a BoundaryType that is solid in the z (like p/s).  Crossply will add some “composite” quad elements above and below the transverse RVE.  The value given is the thickness of this layer in absolute length dimension.</w:t>
+      </w:r>
+    </w:p>
+    <w:p>
+      <w:r>
+        <w:rPr>
+          <w:rFonts w:ascii="Consolas" w:eastAsia="Consolas" w:hAnsi="Consolas" w:cs="Consolas"/>
+        </w:rPr>
+        <w:t>CrossPly</w:t>
+      </w:r>
+      <w:r>
+        <w:rPr>
+          <w:rFonts w:ascii="Consolas" w:eastAsia="Consolas" w:hAnsi="Consolas" w:cs="Consolas"/>
+        </w:rPr>
+        <w:tab/>
+        <w:t>0.037</w:t>
+      </w:r>
+    </w:p>
+    <w:p>
+      <w:pPr>
         <w:pStyle w:val="Heading1"/>
       </w:pPr>
+    </w:p>
+    <w:p>
+      <w:pPr>
+        <w:pStyle w:val="Heading1"/>
+      </w:pPr>
       <w:r>
         <w:t>Programming Guidelines</w:t>
       </w:r>
@@ -2605,35 +2259,18 @@
         <w:rPr>
           <w:rFonts w:ascii="Consolas" w:eastAsia="Consolas" w:hAnsi="Consolas" w:cs="Consolas"/>
         </w:rPr>
-        <w:lastRenderedPageBreak/>
         <w:tab/>
         <w:t>#endregion</w:t>
       </w:r>
     </w:p>
     <w:p>
       <w:r>
-        <w:t xml:space="preserve">All variables should be private, with public get/set properties which call on the private </w:t>
-      </w:r>
-      <w:proofErr w:type="gramStart"/>
-      <w:r>
-        <w:t>properties</w:t>
-      </w:r>
-      <w:proofErr w:type="gramEnd"/>
-      <w:r>
-        <w:t xml:space="preserve"> when needed.</w:t>
-      </w:r>
-    </w:p>
-    <w:p>
-      <w:r>
-        <w:t xml:space="preserve">Private variables generally lowercase, while public </w:t>
-      </w:r>
-      <w:proofErr w:type="gramStart"/>
-      <w:r>
-        <w:t>are</w:t>
-      </w:r>
-      <w:proofErr w:type="gramEnd"/>
-      <w:r>
-        <w:t xml:space="preserve"> uppercase with the same name.  All methods are uppercase. Use CamelCase for all variables.</w:t>
+        <w:t>All variables should be private, with public get/set properties which call on the private properties when needed.</w:t>
+      </w:r>
+    </w:p>
+    <w:p>
+      <w:r>
+        <w:t>Private variables generally lowercase, while public are uppercase with the same name.  All methods are uppercase. Use CamelCase for all variables.</w:t>
       </w:r>
     </w:p>
     <w:p>
@@ -2654,44 +2291,27 @@
     </w:p>
     <w:p>
       <w:r>
-        <w:t xml:space="preserve">You can run </w:t>
-      </w:r>
-      <w:proofErr w:type="spellStart"/>
-      <w:r>
-        <w:t>RandomRVEGenerator</w:t>
-      </w:r>
-      <w:proofErr w:type="spellEnd"/>
-      <w:r>
-        <w:t xml:space="preserve"> from the </w:t>
-      </w:r>
-      <w:proofErr w:type="spellStart"/>
-      <w:r>
-        <w:t>commandline</w:t>
-      </w:r>
-      <w:proofErr w:type="spellEnd"/>
-      <w:r>
-        <w:t xml:space="preserve"> and pass in arguments.  The arguments can be a file name (with full or relative path) or a directory (with full or relative path).  If it’s a directory, it’ll try to run all .txt files in the directory.  You can separate directories with </w:t>
-      </w:r>
-      <w:proofErr w:type="gramStart"/>
-      <w:r>
-        <w:t>a space</w:t>
-      </w:r>
-      <w:proofErr w:type="gramEnd"/>
-      <w:r>
-        <w:t>.  Like this:</w:t>
-      </w:r>
-    </w:p>
-    <w:p>
-      <w:pPr>
-        <w:rPr>
-          <w:rFonts w:ascii="Consolas" w:eastAsia="Consolas" w:hAnsi="Consolas" w:cs="Consolas"/>
-        </w:rPr>
-      </w:pPr>
-      <w:r>
-        <w:rPr>
-          <w:rFonts w:ascii="Consolas" w:eastAsia="Consolas" w:hAnsi="Consolas" w:cs="Consolas"/>
-        </w:rPr>
-        <w:t>“E:\Google Drive\IFAM\Projects\FDEM\Programs\FiberDEM_2D\fiberdem\bin\Debug\FiberDEM.exe” “E:\Google Drive\IFAM\Projects\FDEM\Programs\FiberDEM_2D\fiberdem\bin\Debug\Test\Dummy2” “E:\Google Drive\IFAM\Projects\FDEM\Programs\FiberDEM_2D\fiberdem\bin\Debug\Test\Dummy”</w:t>
+        <w:t>You can run RandomRVEGenerator from the commandline and pass in arguments.  The arguments can be a file name (with full or relative path) or a directory (with full or relative path).  If it’s a directory, it’ll try to run all .txt files in the directory.  You can separate directories with a space.  Like this:</w:t>
+      </w:r>
+    </w:p>
+    <w:p>
+      <w:pPr>
+        <w:rPr>
+          <w:rFonts w:ascii="Consolas" w:eastAsia="Consolas" w:hAnsi="Consolas" w:cs="Consolas"/>
+        </w:rPr>
+      </w:pPr>
+      <w:r>
+        <w:rPr>
+          <w:rFonts w:ascii="Consolas" w:eastAsia="Consolas" w:hAnsi="Consolas" w:cs="Consolas"/>
+        </w:rPr>
+        <w:t xml:space="preserve">“E:\Google Drive\IFAM\Projects\FDEM\Programs\FiberDEM_2D\fiberdem\bin\Debug\FiberDEM.exe” “E:\Google Drive\IFAM\Projects\FDEM\Programs\FiberDEM_2D\fiberdem\bin\Debug\Test\Dummy2” </w:t>
+      </w:r>
+      <w:r>
+        <w:rPr>
+          <w:rFonts w:ascii="Consolas" w:eastAsia="Consolas" w:hAnsi="Consolas" w:cs="Consolas"/>
+        </w:rPr>
+        <w:lastRenderedPageBreak/>
+        <w:t>“E:\Google Drive\IFAM\Projects\FDEM\Programs\FiberDEM_2D\fiberdem\bin\Debug\Test\Dummy”</w:t>
       </w:r>
     </w:p>
     <w:p>

</xml_diff>